<commit_message>
Add detector-accuracy, parameter-efficiency and application-orientation claims
Thesis 5.4.1 frames detector accuracy as higher-than-reported with less
input; new 5.4.7 with parameter-efficiency tables 5.24-5.25; new 5.6.5
application orientation; README claims table. Paper updated to match.

Co-Authored-By: Claude Opus 5 (1M context) <noreply@anthropic.com>
</commit_message>
<xml_diff>
--- a/ICCIT format writing/paper.docx
+++ b/ICCIT format writing/paper.docx
@@ -62,7 +62,7 @@
           <w:b/>
           <w:sz w:val="18"/>
         </w:rPr>
-        <w:t>Small language models that run on local hardware are attractive for emotionally supportive conversation, because a user's disclosure never has to leave the device. It is unclear, however, whether such models benefit from a separate emotion detector or should simply be prompted to recognise the emotion and respond in one step. We present a controlled study on the EmpatheticDialogues benchmark in which every system uses the same 300 test conversations, the same decoding settings and a single 8 GB GPU. Our decoupled system passes the three most probable of 32 emotions from a RoBERTa-base detector (50.3% top-1 accuracy), together with emotion-specific guidance and attention-derived cue words, to a 4-bit Phi-4-mini generator. We evaluate replies with rule adherence, the WASSA 2024 empathy classifier, emotion validation, a blind two-judge LLM panel and a human forced-choice study, using paired tests with Holm correction. The decoupled system (4.0B parameters) is significantly more empathetic and emotionally faithful than a 1.5B single model, but a 7.6B single model remains stronger on rule adherence and empathy. Three analyses show that detection accuracy is not the bottleneck: incorrect labels do not degrade replies, a more accurate detector brings no gain, and the generator's own emotion choice is less accurate than the detector's yet yields better replies. The benefit comes from how the detected emotion is used rather than how accurately it is detected.</w:t>
+        <w:t>Small language models that run on local hardware are attractive for emotionally supportive conversation, because a user's disclosure never has to leave the device. It is unclear, however, whether such models benefit from a separate emotion detector or should simply be prompted to recognise the emotion and respond in one step. We present a controlled study on the EmpatheticDialogues benchmark in which every system uses the same 300 test conversations, the same decoding settings and a single 8 GB GPU. Our decoupled system passes the three most probable of 32 emotions from a RoBERTa-base detector (50.3% top-1 accuracy), together with emotion-specific guidance and attention-derived cue words, to a 4-bit Phi-4-mini generator. We evaluate replies with rule adherence, the WASSA 2024 empathy classifier, emotion validation, a blind two-judge LLM panel and a human forced-choice study, using paired tests with Holm correction. The decoupled system (4.0B parameters) is significantly more empathetic and emotionally faithful than a 1.5B single model, but a 7.6B single model remains stronger on rule adherence and empathy; with 52% of its parameters, our system reaches 97.5% of its overall AI-judge score. Three analyses show that detection accuracy is not the bottleneck: incorrect labels do not degrade replies, a more accurate detector brings no gain, and the generator's own emotion choice is less accurate than the detector's yet yields better replies. The benefit comes from how the detected emotion is used rather than how accurately it is detected.</w:t>
       </w:r>
     </w:p>
     <w:p>
@@ -4117,7 +4117,7 @@
           <w:rFonts w:ascii="Times New Roman" w:hAnsi="Times New Roman"/>
           <w:sz w:val="20"/>
         </w:rPr>
-        <w:t>For reference, our detector reads only the first user message yet exceeds the emotion accuracy reported by joint generation models that use the full dialogue context (30.6-48.3%) [2], [12], [31]. Because those models predict emotion as an auxiliary task, this comparison supports the use of a dedicated detector rather than claiming better generation.</w:t>
+        <w:t>For reference, our detector reads only the first user message yet exceeds the emotion accuracy reported by joint generation models that use the full dialogue context (30.6-48.3%) [2], [12], [31]. It thus achieves higher accuracy with less input. Because those models predict emotion as an auxiliary task and were not re-trained under our setting, this comparison supports the use of a dedicated detector rather than a claim of the best detector on ED.</w:t>
       </w:r>
     </w:p>
     <w:p>
@@ -4183,6 +4183,50 @@
           <w:sz w:val="20"/>
         </w:rPr>
         <w:t>Our results give a qualified answer. At comparable or smaller scale, a separate detector combined with emotion-specific guidance yields replies that are more empathetic and more faithful to the user's emotion, and the detector's decision remains visible and auditable. It does not, however, outperform a single model with nearly twice as many parameters, which remains preferable when only output quality matters and such hardware is available.</w:t>
+      </w:r>
+    </w:p>
+    <w:p>
+      <w:pPr>
+        <w:spacing w:before="0" w:after="0" w:line="240" w:lineRule="auto"/>
+        <w:ind w:firstLine="180"/>
+        <w:jc w:val="both"/>
+      </w:pPr>
+      <w:r>
+        <w:rPr>
+          <w:rFonts w:ascii="Times New Roman" w:hAnsi="Times New Roman"/>
+          <w:b/>
+          <w:sz w:val="20"/>
+        </w:rPr>
+        <w:t>Parameter efficiency.</w:t>
+      </w:r>
+      <w:r>
+        <w:rPr>
+          <w:rFonts w:ascii="Times New Roman" w:hAnsi="Times New Roman"/>
+          <w:sz w:val="20"/>
+        </w:rPr>
+        <w:t xml:space="preserve"> With 52% of the parameters of the 7.6B single model, our system reaches 97.5% of its overall AI-judge score (difference not significant) and 96.2% of its judge-rated empathy (difference significant). At the detector level, RoBERTa-large has 2.8x the parameters of RoBERTa-base and 2.9 points higher test accuracy (Section III-B) but brings no gain in reply quality (Table III), so the smaller detector is the efficient choice.</w:t>
+      </w:r>
+    </w:p>
+    <w:p>
+      <w:pPr>
+        <w:spacing w:before="0" w:after="0" w:line="240" w:lineRule="auto"/>
+        <w:ind w:firstLine="180"/>
+        <w:jc w:val="both"/>
+      </w:pPr>
+      <w:r>
+        <w:rPr>
+          <w:rFonts w:ascii="Times New Roman" w:hAnsi="Times New Roman"/>
+          <w:b/>
+          <w:sz w:val="20"/>
+        </w:rPr>
+        <w:t>Application orientation.</w:t>
+      </w:r>
+      <w:r>
+        <w:rPr>
+          <w:rFonts w:ascii="Times New Roman" w:hAnsi="Times New Roman"/>
+          <w:sz w:val="20"/>
+        </w:rPr>
+        <w:t xml:space="preserve"> The system runs entirely on one 8 GB consumer GPU, so disclosures need not leave the device. We extended it into a multi-turn agent in which the detector reads the user's last four turns, the generator keeps the last ten exchanges, and every turn displays the candidate emotions, the chosen emotion and the cue words. This audit trail lets developers or clinicians see why a reply took a given tone and insert safeguards before generation, which a single end-to-end model cannot offer.</w:t>
       </w:r>
     </w:p>
     <w:p>

</xml_diff>

<commit_message>
Add resource-efficiency results: GPU memory and response time
Benchmark (50 messages, RTX 4060): final system 3.40 GB peak vs 5.47 GB
for Qwen2.5-7B (-38%), 4.17 vs 3.91 s per reply (p = 0.10). New thesis
tables 5.26-5.27 in 5.4.7; 3.8, 5.6, README and ICCIT paper updated.

Co-Authored-By: Claude Opus 5 (1M context) <noreply@anthropic.com>
</commit_message>
<xml_diff>
--- a/ICCIT format writing/paper.docx
+++ b/ICCIT format writing/paper.docx
@@ -62,7 +62,7 @@
           <w:b/>
           <w:sz w:val="18"/>
         </w:rPr>
-        <w:t>Small language models that run on local hardware are attractive for emotionally supportive conversation, because a user's disclosure never has to leave the device. It is unclear, however, whether such models benefit from a separate emotion detector or should simply be prompted to recognise the emotion and respond in one step. We present a controlled study on the EmpatheticDialogues benchmark in which every system uses the same 300 test conversations, the same decoding settings and a single 8 GB GPU. Our decoupled system passes the three most probable of 32 emotions from a RoBERTa-base detector (50.3% top-1 accuracy), together with emotion-specific guidance and attention-derived cue words, to a 4-bit Phi-4-mini generator. We evaluate replies with rule adherence, the WASSA 2024 empathy classifier, emotion validation, a blind two-judge LLM panel and a human forced-choice study, using paired tests with Holm correction. The decoupled system (4.0B parameters) is significantly more empathetic and emotionally faithful than a 1.5B single model, but a 7.6B single model remains stronger on rule adherence and empathy; with 52% of its parameters, our system reaches 97.5% of its overall AI-judge score. Three analyses show that detection accuracy is not the bottleneck: incorrect labels do not degrade replies, a more accurate detector brings no gain, and the generator's own emotion choice is less accurate than the detector's yet yields better replies. The benefit comes from how the detected emotion is used rather than how accurately it is detected.</w:t>
+        <w:t>Small language models that run on local hardware are attractive for emotionally supportive conversation, because a user's disclosure never has to leave the device. It is unclear, however, whether such models benefit from a separate emotion detector or should simply be prompted to recognise the emotion and respond in one step. We present a controlled study on the EmpatheticDialogues benchmark in which every system uses the same 300 test conversations, the same decoding settings and a single 8 GB GPU. Our decoupled system passes the three most probable of 32 emotions from a RoBERTa-base detector (50.3% top-1 accuracy), together with emotion-specific guidance and attention-derived cue words, to a 4-bit Phi-4-mini generator. We evaluate replies with rule adherence, the WASSA 2024 empathy classifier, emotion validation, a blind two-judge LLM panel and a human forced-choice study, using paired tests with Holm correction. The decoupled system (4.0B parameters) is significantly more empathetic and emotionally faithful than a 1.5B single model, but a 7.6B single model remains stronger on rule adherence and empathy; with 52% of its parameters and 38% less GPU memory, at a similar response time, our system reaches 97.5% of its overall AI-judge score. Three analyses show that detection accuracy is not the bottleneck: incorrect labels do not degrade replies, a more accurate detector brings no gain, and the generator's own emotion choice is less accurate than the detector's yet yields better replies. The benefit comes from how the detected emotion is used rather than how accurately it is detected.</w:t>
       </w:r>
     </w:p>
     <w:p>
@@ -4219,6 +4219,28 @@
           <w:b/>
           <w:sz w:val="20"/>
         </w:rPr>
+        <w:t>Resource use.</w:t>
+      </w:r>
+      <w:r>
+        <w:rPr>
+          <w:rFonts w:ascii="Times New Roman" w:hAnsi="Times New Roman"/>
+          <w:sz w:val="20"/>
+        </w:rPr>
+        <w:t xml:space="preserve"> Measured on the same GPU over 50 messages, our system needs 38% less peak GPU memory than the 7.6B single model (3.40 GB against 5.47 GB) with no significant difference in response time (4.17 s against 3.91 s per reply, Wilcoxon p = 0.10; 65.7 against 65.4 ms per generated token). The detector and stage-1 selection add only 0.31 s, about 7% of the reply time. The 1.5B single model is lighter (2.90 GB) and 2.6x faster, but significantly less empathetic.</w:t>
+      </w:r>
+    </w:p>
+    <w:p>
+      <w:pPr>
+        <w:spacing w:before="0" w:after="0" w:line="240" w:lineRule="auto"/>
+        <w:ind w:firstLine="180"/>
+        <w:jc w:val="both"/>
+      </w:pPr>
+      <w:r>
+        <w:rPr>
+          <w:rFonts w:ascii="Times New Roman" w:hAnsi="Times New Roman"/>
+          <w:b/>
+          <w:sz w:val="20"/>
+        </w:rPr>
         <w:t>Application orientation.</w:t>
       </w:r>
       <w:r>
@@ -4240,7 +4262,7 @@
           <w:rFonts w:ascii="Times New Roman" w:hAnsi="Times New Roman"/>
           <w:sz w:val="20"/>
         </w:rPr>
-        <w:t>This study has several limitations. We did not evaluate a single-model baseline built on Phi-4-mini, so the comparison with the 1.5B single model combines decoupling, guidance and generator capacity; Section V-C separates these only with the Qwen2.5-1.5B generator. Automatic measures are proxies: the acknowledgement check is keyword-based, WASSA rewards length (Spearman ρ = 0.14-0.54 with word count within systems) and was trained on discussions of news articles [17], emotion validation uses our own detector, and LLM judges prefer longer answers [14]. Judge results rest on 64 conversations. Evaluation covers single turns in English. Our system reuses stock phrases in 58.7% of replies.</w:t>
+        <w:t>This study has several limitations. We did not evaluate a single-model baseline built on Phi-4-mini, so the comparison with the 1.5B single model combines decoupling, guidance and generator capacity; Section V-C separates these only with the Qwen2.5-1.5B generator. Automatic measures are proxies: the acknowledgement check is keyword-based, WASSA rewards length (Spearman ρ = 0.14-0.54 with word count within systems) and was trained on discussions of news articles [17], emotion validation uses our own detector, and LLM judges prefer longer answers [14]. Judge results rest on 64 conversations. Evaluation covers single turns in English, and resource use was measured on one GPU. Our system reuses stock phrases in 58.7% of replies.</w:t>
       </w:r>
     </w:p>
     <w:p>

</xml_diff>

<commit_message>
Explain why the detector outperforms joint models' reported accuracy
Pre-trained RoBERTa initialisation vs GloVe-initialised joint models
(MoEL, CASE), supported by RoBERTa-GPT2 reaching comparable accuracy,
plus single-task training. Added to thesis 5.4.1 and paper V-D.

Co-Authored-By: Claude Opus 5 (1M context) <noreply@anthropic.com>
</commit_message>
<xml_diff>
--- a/ICCIT format writing/paper.docx
+++ b/ICCIT format writing/paper.docx
@@ -4117,7 +4117,7 @@
           <w:rFonts w:ascii="Times New Roman" w:hAnsi="Times New Roman"/>
           <w:sz w:val="20"/>
         </w:rPr>
-        <w:t>For reference, our detector reads only the first user message yet exceeds the emotion accuracy reported by joint generation models that use the full dialogue context (30.6-48.3%) [2], [12], [31]. It thus achieves higher accuracy with less input. Because those models predict emotion as an auxiliary task and were not re-trained under our setting, this comparison supports the use of a dedicated detector rather than a claim of the best detector on ED.</w:t>
+        <w:t>For reference, our detector reads only the first user message yet exceeds the emotion accuracy reported by joint generation models that use the full dialogue context (30.6-48.3%) [2], [12], [31]. It achieves higher accuracy with less input for two reasons. First, it is initialised from RoBERTa, pre-trained on about 160 GB of text [18], whereas joint models such as MoEL and CASE start from GloVe word vectors and train their encoders on ED alone [5], [7]; RoBERTa-GPT2, which is built on pre-trained RoBERTa and GPT-2, reaches a comparable 51.5% [32], showing that pre-training, not access to the full dialogue, drives the accuracy. Second, our detector is trained and selected only for emotion classification, whereas joint models share their capacity with response generation. As those models were not re-trained under our setting, we do not claim the best detector on ED.</w:t>
       </w:r>
     </w:p>
     <w:p>
@@ -4284,7 +4284,7 @@
           <w:rFonts w:ascii="Times New Roman" w:hAnsi="Times New Roman"/>
           <w:sz w:val="20"/>
         </w:rPr>
-        <w:t xml:space="preserve"> ED is used under its CC BY-NC 4.0 licence, and no data from real users was collected; only ED text was sent to the judge APIs. The label set has no category for suicidal ideation and the system has no crisis safeguard, so it must not be deployed as a mental-health service without a reviewed crisis filter and referral mechanism [32]. </w:t>
+        <w:t xml:space="preserve"> ED is used under its CC BY-NC 4.0 licence, and no data from real users was collected; only ED text was sent to the judge APIs. The label set has no category for suicidal ideation and the system has no crisis safeguard, so it must not be deployed as a mental-health service without a reviewed crisis filter and referral mechanism [33]. </w:t>
       </w:r>
       <w:r>
         <w:rPr>
@@ -4882,6 +4882,22 @@
         </w:rPr>
         <w:t>[32]</w:t>
         <w:tab/>
+        <w:t>Y. Liu, W. Maier, W. Minker, and S. Ultes, "Empathetic dialogue generation with pre-trained RoBERTa-GPT2 and external knowledge," in Proc. Int. Workshop Spoken Dialogue System Technology (IWSDS), 2021; arXiv:2109.03004.</w:t>
+      </w:r>
+    </w:p>
+    <w:p>
+      <w:pPr>
+        <w:spacing w:before="0" w:after="0" w:line="240" w:lineRule="auto"/>
+        <w:ind w:left="432" w:hanging="432"/>
+        <w:jc w:val="both"/>
+      </w:pPr>
+      <w:r>
+        <w:rPr>
+          <w:rFonts w:ascii="Times New Roman" w:hAnsi="Times New Roman"/>
+          <w:sz w:val="16"/>
+        </w:rPr>
+        <w:t>[33]</w:t>
+        <w:tab/>
         <w:t>World Health Organization and International Association for Suicide Prevention, Preventing Suicide: A Resource for Media Professionals, Update 2023. Geneva, Switzerland: WHO, 2023. [Online]. Available: https://www.who.int/publications/i/item/9789240076846</w:t>
       </w:r>
     </w:p>

</xml_diff>

<commit_message>
Replace buggy LoRA baseline with corrected run; add parameter justifications
The original monolithic LoRA baseline masked its end-of-turn token (pad =
eos), so it never stopped. Retrained as fine_tuned_fixed: 22.3% all rules,
10-word casual replies. Wrong 'imitated ED questions' claims corrected
using measured ED listener statistics (4.3% meet all rules).

New thesis section 4.2.7 and Table 4.9 justify every parameter with
published or measured evidence (adds Holtzman et al. 2020). AI-judge
statistics now exclude the flawed run; fixed-baseline judge rows pending.

Co-Authored-By: Claude Opus 5 (1M context) <noreply@anthropic.com>
</commit_message>
<xml_diff>
--- a/ICCIT format writing/paper.docx
+++ b/ICCIT format writing/paper.docx
@@ -422,7 +422,7 @@
           <w:rFonts w:ascii="Times New Roman" w:hAnsi="Times New Roman"/>
           <w:sz w:val="20"/>
         </w:rPr>
-        <w:t xml:space="preserve">Given a user's message, the system must produce a reply that satisfies three rules derived from supportive-listening practice: it (R1) acknowledges the feeling, (R2) asks exactly one question and (R3) stays within 120 words. The rules make over-questioning measurable: a model fine-tuned end to end on ED listener replies asks 7.07 questions per reply (Section V). We use the official ED train, validation and test partitions. Each conversation contributes its </w:t>
+        <w:t xml:space="preserve">Given a user's message, the system must produce a reply that satisfies three rules derived from supportive-listening practice: it (R1) acknowledges the feeling, (R2) asks exactly one question and (R3) stays within 120 words. The rules are not satisfied by imitating the data: real ED listener replies acknowledge the feeling in only 10.6% of cases and meet all three rules in 4.3%. We use the official ED train, validation and test partitions. Each conversation contributes its </w:t>
       </w:r>
       <w:r>
         <w:rPr>
@@ -729,7 +729,7 @@
           <w:rFonts w:ascii="Times New Roman" w:hAnsi="Times New Roman"/>
           <w:sz w:val="20"/>
         </w:rPr>
-        <w:t xml:space="preserve">: Qwen2.5-1.5B fine-tuned end to end on ED replies with LoRA [22]. </w:t>
+        <w:t xml:space="preserve">: Qwen2.5-1.5B fine-tuned end to end on ED replies with LoRA [22] (rank 16, alpha 32, learning rate 2e-4, dropout 0.1, best epoch by validation loss). </w:t>
       </w:r>
       <w:r>
         <w:rPr>
@@ -1059,7 +1059,7 @@
       <w:tr>
         <w:tc>
           <w:tcPr>
-            <w:tcW w:type="dxa" w:w="4340"/>
+            <w:tcW w:type="dxa" w:w="3333"/>
           </w:tcPr>
           <w:p>
             <w:pPr>
@@ -1080,7 +1080,7 @@
         </w:tc>
         <w:tc>
           <w:tcPr>
-            <w:tcW w:type="dxa" w:w="723"/>
+            <w:tcW w:type="dxa" w:w="555"/>
           </w:tcPr>
           <w:p>
             <w:pPr>
@@ -1101,7 +1101,7 @@
         </w:tc>
         <w:tc>
           <w:tcPr>
-            <w:tcW w:type="dxa" w:w="1085"/>
+            <w:tcW w:type="dxa" w:w="833"/>
           </w:tcPr>
           <w:p>
             <w:pPr>
@@ -1122,7 +1122,7 @@
         </w:tc>
         <w:tc>
           <w:tcPr>
-            <w:tcW w:type="dxa" w:w="844"/>
+            <w:tcW w:type="dxa" w:w="648"/>
           </w:tcPr>
           <w:p>
             <w:pPr>
@@ -1143,7 +1143,7 @@
         </w:tc>
         <w:tc>
           <w:tcPr>
-            <w:tcW w:type="dxa" w:w="603"/>
+            <w:tcW w:type="dxa" w:w="463"/>
           </w:tcPr>
           <w:p>
             <w:pPr>
@@ -1164,7 +1164,7 @@
         </w:tc>
         <w:tc>
           <w:tcPr>
-            <w:tcW w:type="dxa" w:w="603"/>
+            <w:tcW w:type="dxa" w:w="463"/>
           </w:tcPr>
           <w:p>
             <w:pPr>
@@ -1185,7 +1185,7 @@
         </w:tc>
         <w:tc>
           <w:tcPr>
-            <w:tcW w:type="dxa" w:w="964"/>
+            <w:tcW w:type="dxa" w:w="741"/>
           </w:tcPr>
           <w:p>
             <w:pPr>
@@ -1206,7 +1206,7 @@
         </w:tc>
         <w:tc>
           <w:tcPr>
-            <w:tcW w:type="dxa" w:w="603"/>
+            <w:tcW w:type="dxa" w:w="1666"/>
           </w:tcPr>
           <w:p>
             <w:pPr>
@@ -1227,7 +1227,7 @@
         </w:tc>
         <w:tc>
           <w:tcPr>
-            <w:tcW w:type="dxa" w:w="603"/>
+            <w:tcW w:type="dxa" w:w="1666"/>
           </w:tcPr>
           <w:p>
             <w:pPr>
@@ -1250,7 +1250,7 @@
       <w:tr>
         <w:tc>
           <w:tcPr>
-            <w:tcW w:type="dxa" w:w="4340"/>
+            <w:tcW w:type="dxa" w:w="3333"/>
           </w:tcPr>
           <w:p>
             <w:pPr>
@@ -1270,7 +1270,7 @@
         </w:tc>
         <w:tc>
           <w:tcPr>
-            <w:tcW w:type="dxa" w:w="723"/>
+            <w:tcW w:type="dxa" w:w="555"/>
           </w:tcPr>
           <w:p>
             <w:pPr>
@@ -1290,7 +1290,7 @@
         </w:tc>
         <w:tc>
           <w:tcPr>
-            <w:tcW w:type="dxa" w:w="1085"/>
+            <w:tcW w:type="dxa" w:w="833"/>
           </w:tcPr>
           <w:p>
             <w:pPr>
@@ -1310,7 +1310,7 @@
         </w:tc>
         <w:tc>
           <w:tcPr>
-            <w:tcW w:type="dxa" w:w="844"/>
+            <w:tcW w:type="dxa" w:w="648"/>
           </w:tcPr>
           <w:p>
             <w:pPr>
@@ -1330,7 +1330,7 @@
         </w:tc>
         <w:tc>
           <w:tcPr>
-            <w:tcW w:type="dxa" w:w="603"/>
+            <w:tcW w:type="dxa" w:w="463"/>
           </w:tcPr>
           <w:p>
             <w:pPr>
@@ -1350,7 +1350,7 @@
         </w:tc>
         <w:tc>
           <w:tcPr>
-            <w:tcW w:type="dxa" w:w="603"/>
+            <w:tcW w:type="dxa" w:w="463"/>
           </w:tcPr>
           <w:p>
             <w:pPr>
@@ -1370,7 +1370,7 @@
         </w:tc>
         <w:tc>
           <w:tcPr>
-            <w:tcW w:type="dxa" w:w="964"/>
+            <w:tcW w:type="dxa" w:w="741"/>
           </w:tcPr>
           <w:p>
             <w:pPr>
@@ -1390,7 +1390,7 @@
         </w:tc>
         <w:tc>
           <w:tcPr>
-            <w:tcW w:type="dxa" w:w="603"/>
+            <w:tcW w:type="dxa" w:w="1666"/>
           </w:tcPr>
           <w:p>
             <w:pPr>
@@ -1410,7 +1410,7 @@
         </w:tc>
         <w:tc>
           <w:tcPr>
-            <w:tcW w:type="dxa" w:w="603"/>
+            <w:tcW w:type="dxa" w:w="1666"/>
           </w:tcPr>
           <w:p>
             <w:pPr>
@@ -1432,7 +1432,7 @@
       <w:tr>
         <w:tc>
           <w:tcPr>
-            <w:tcW w:type="dxa" w:w="4340"/>
+            <w:tcW w:type="dxa" w:w="3333"/>
           </w:tcPr>
           <w:p>
             <w:pPr>
@@ -1452,7 +1452,7 @@
         </w:tc>
         <w:tc>
           <w:tcPr>
-            <w:tcW w:type="dxa" w:w="723"/>
+            <w:tcW w:type="dxa" w:w="555"/>
           </w:tcPr>
           <w:p>
             <w:pPr>
@@ -1472,7 +1472,7 @@
         </w:tc>
         <w:tc>
           <w:tcPr>
-            <w:tcW w:type="dxa" w:w="1085"/>
+            <w:tcW w:type="dxa" w:w="833"/>
           </w:tcPr>
           <w:p>
             <w:pPr>
@@ -1486,13 +1486,13 @@
                 <w:rFonts w:ascii="Times New Roman" w:hAnsi="Times New Roman"/>
                 <w:sz w:val="16"/>
               </w:rPr>
-              <w:t>0.0</w:t>
+              <w:t>22.3</w:t>
             </w:r>
           </w:p>
         </w:tc>
         <w:tc>
           <w:tcPr>
-            <w:tcW w:type="dxa" w:w="844"/>
+            <w:tcW w:type="dxa" w:w="648"/>
           </w:tcPr>
           <w:p>
             <w:pPr>
@@ -1506,13 +1506,13 @@
                 <w:rFonts w:ascii="Times New Roman" w:hAnsi="Times New Roman"/>
                 <w:sz w:val="16"/>
               </w:rPr>
-              <w:t>1.7</w:t>
+              <w:t>74.0</w:t>
             </w:r>
           </w:p>
         </w:tc>
         <w:tc>
           <w:tcPr>
-            <w:tcW w:type="dxa" w:w="603"/>
+            <w:tcW w:type="dxa" w:w="463"/>
           </w:tcPr>
           <w:p>
             <w:pPr>
@@ -1526,13 +1526,13 @@
                 <w:rFonts w:ascii="Times New Roman" w:hAnsi="Times New Roman"/>
                 <w:sz w:val="16"/>
               </w:rPr>
-              <w:t>200.7</w:t>
+              <w:t>10.0</w:t>
             </w:r>
           </w:p>
         </w:tc>
         <w:tc>
           <w:tcPr>
-            <w:tcW w:type="dxa" w:w="603"/>
+            <w:tcW w:type="dxa" w:w="463"/>
           </w:tcPr>
           <w:p>
             <w:pPr>
@@ -1546,13 +1546,13 @@
                 <w:rFonts w:ascii="Times New Roman" w:hAnsi="Times New Roman"/>
                 <w:sz w:val="16"/>
               </w:rPr>
-              <w:t>4.19</w:t>
+              <w:t>3.36</w:t>
             </w:r>
           </w:p>
         </w:tc>
         <w:tc>
           <w:tcPr>
-            <w:tcW w:type="dxa" w:w="964"/>
+            <w:tcW w:type="dxa" w:w="741"/>
           </w:tcPr>
           <w:p>
             <w:pPr>
@@ -1566,13 +1566,13 @@
                 <w:rFonts w:ascii="Times New Roman" w:hAnsi="Times New Roman"/>
                 <w:sz w:val="16"/>
               </w:rPr>
-              <w:t>20.0</w:t>
+              <w:t>18.3</w:t>
             </w:r>
           </w:p>
         </w:tc>
         <w:tc>
           <w:tcPr>
-            <w:tcW w:type="dxa" w:w="603"/>
+            <w:tcW w:type="dxa" w:w="1666"/>
           </w:tcPr>
           <w:p>
             <w:pPr>
@@ -1585,14 +1585,15 @@
               <w:rPr>
                 <w:rFonts w:ascii="Times New Roman" w:hAnsi="Times New Roman"/>
                 <w:sz w:val="16"/>
+                <w:highlight w:val="yellow"/>
               </w:rPr>
-              <w:t>3.44</w:t>
+              <w:t>PENDING: judge</w:t>
             </w:r>
           </w:p>
         </w:tc>
         <w:tc>
           <w:tcPr>
-            <w:tcW w:type="dxa" w:w="603"/>
+            <w:tcW w:type="dxa" w:w="1666"/>
           </w:tcPr>
           <w:p>
             <w:pPr>
@@ -1605,8 +1606,9 @@
               <w:rPr>
                 <w:rFonts w:ascii="Times New Roman" w:hAnsi="Times New Roman"/>
                 <w:sz w:val="16"/>
+                <w:highlight w:val="yellow"/>
               </w:rPr>
-              <w:t>4.44</w:t>
+              <w:t>PENDING: judge</w:t>
             </w:r>
           </w:p>
         </w:tc>
@@ -1614,7 +1616,7 @@
       <w:tr>
         <w:tc>
           <w:tcPr>
-            <w:tcW w:type="dxa" w:w="4340"/>
+            <w:tcW w:type="dxa" w:w="3333"/>
           </w:tcPr>
           <w:p>
             <w:pPr>
@@ -1634,7 +1636,7 @@
         </w:tc>
         <w:tc>
           <w:tcPr>
-            <w:tcW w:type="dxa" w:w="723"/>
+            <w:tcW w:type="dxa" w:w="555"/>
           </w:tcPr>
           <w:p>
             <w:pPr>
@@ -1654,7 +1656,7 @@
         </w:tc>
         <w:tc>
           <w:tcPr>
-            <w:tcW w:type="dxa" w:w="1085"/>
+            <w:tcW w:type="dxa" w:w="833"/>
           </w:tcPr>
           <w:p>
             <w:pPr>
@@ -1674,7 +1676,7 @@
         </w:tc>
         <w:tc>
           <w:tcPr>
-            <w:tcW w:type="dxa" w:w="844"/>
+            <w:tcW w:type="dxa" w:w="648"/>
           </w:tcPr>
           <w:p>
             <w:pPr>
@@ -1694,7 +1696,7 @@
         </w:tc>
         <w:tc>
           <w:tcPr>
-            <w:tcW w:type="dxa" w:w="603"/>
+            <w:tcW w:type="dxa" w:w="463"/>
           </w:tcPr>
           <w:p>
             <w:pPr>
@@ -1714,7 +1716,7 @@
         </w:tc>
         <w:tc>
           <w:tcPr>
-            <w:tcW w:type="dxa" w:w="603"/>
+            <w:tcW w:type="dxa" w:w="463"/>
           </w:tcPr>
           <w:p>
             <w:pPr>
@@ -1734,7 +1736,7 @@
         </w:tc>
         <w:tc>
           <w:tcPr>
-            <w:tcW w:type="dxa" w:w="964"/>
+            <w:tcW w:type="dxa" w:w="741"/>
           </w:tcPr>
           <w:p>
             <w:pPr>
@@ -1754,7 +1756,7 @@
         </w:tc>
         <w:tc>
           <w:tcPr>
-            <w:tcW w:type="dxa" w:w="603"/>
+            <w:tcW w:type="dxa" w:w="1666"/>
           </w:tcPr>
           <w:p>
             <w:pPr>
@@ -1774,7 +1776,7 @@
         </w:tc>
         <w:tc>
           <w:tcPr>
-            <w:tcW w:type="dxa" w:w="603"/>
+            <w:tcW w:type="dxa" w:w="1666"/>
           </w:tcPr>
           <w:p>
             <w:pPr>
@@ -1796,7 +1798,7 @@
       <w:tr>
         <w:tc>
           <w:tcPr>
-            <w:tcW w:type="dxa" w:w="4340"/>
+            <w:tcW w:type="dxa" w:w="3333"/>
           </w:tcPr>
           <w:p>
             <w:pPr>
@@ -1816,7 +1818,7 @@
         </w:tc>
         <w:tc>
           <w:tcPr>
-            <w:tcW w:type="dxa" w:w="723"/>
+            <w:tcW w:type="dxa" w:w="555"/>
           </w:tcPr>
           <w:p>
             <w:pPr>
@@ -1836,7 +1838,7 @@
         </w:tc>
         <w:tc>
           <w:tcPr>
-            <w:tcW w:type="dxa" w:w="1085"/>
+            <w:tcW w:type="dxa" w:w="833"/>
           </w:tcPr>
           <w:p>
             <w:pPr>
@@ -1857,7 +1859,7 @@
         </w:tc>
         <w:tc>
           <w:tcPr>
-            <w:tcW w:type="dxa" w:w="844"/>
+            <w:tcW w:type="dxa" w:w="648"/>
           </w:tcPr>
           <w:p>
             <w:pPr>
@@ -1878,7 +1880,7 @@
         </w:tc>
         <w:tc>
           <w:tcPr>
-            <w:tcW w:type="dxa" w:w="603"/>
+            <w:tcW w:type="dxa" w:w="463"/>
           </w:tcPr>
           <w:p>
             <w:pPr>
@@ -1898,7 +1900,7 @@
         </w:tc>
         <w:tc>
           <w:tcPr>
-            <w:tcW w:type="dxa" w:w="603"/>
+            <w:tcW w:type="dxa" w:w="463"/>
           </w:tcPr>
           <w:p>
             <w:pPr>
@@ -1919,7 +1921,7 @@
         </w:tc>
         <w:tc>
           <w:tcPr>
-            <w:tcW w:type="dxa" w:w="964"/>
+            <w:tcW w:type="dxa" w:w="741"/>
           </w:tcPr>
           <w:p>
             <w:pPr>
@@ -1939,7 +1941,7 @@
         </w:tc>
         <w:tc>
           <w:tcPr>
-            <w:tcW w:type="dxa" w:w="603"/>
+            <w:tcW w:type="dxa" w:w="1666"/>
           </w:tcPr>
           <w:p>
             <w:pPr>
@@ -1960,7 +1962,7 @@
         </w:tc>
         <w:tc>
           <w:tcPr>
-            <w:tcW w:type="dxa" w:w="603"/>
+            <w:tcW w:type="dxa" w:w="1666"/>
           </w:tcPr>
           <w:p>
             <w:pPr>
@@ -1983,7 +1985,7 @@
       <w:tr>
         <w:tc>
           <w:tcPr>
-            <w:tcW w:type="dxa" w:w="4340"/>
+            <w:tcW w:type="dxa" w:w="3333"/>
           </w:tcPr>
           <w:p>
             <w:pPr>
@@ -2003,7 +2005,7 @@
         </w:tc>
         <w:tc>
           <w:tcPr>
-            <w:tcW w:type="dxa" w:w="723"/>
+            <w:tcW w:type="dxa" w:w="555"/>
           </w:tcPr>
           <w:p>
             <w:pPr>
@@ -2023,7 +2025,7 @@
         </w:tc>
         <w:tc>
           <w:tcPr>
-            <w:tcW w:type="dxa" w:w="1085"/>
+            <w:tcW w:type="dxa" w:w="833"/>
           </w:tcPr>
           <w:p>
             <w:pPr>
@@ -2043,7 +2045,7 @@
         </w:tc>
         <w:tc>
           <w:tcPr>
-            <w:tcW w:type="dxa" w:w="844"/>
+            <w:tcW w:type="dxa" w:w="648"/>
           </w:tcPr>
           <w:p>
             <w:pPr>
@@ -2063,7 +2065,7 @@
         </w:tc>
         <w:tc>
           <w:tcPr>
-            <w:tcW w:type="dxa" w:w="603"/>
+            <w:tcW w:type="dxa" w:w="463"/>
           </w:tcPr>
           <w:p>
             <w:pPr>
@@ -2083,7 +2085,7 @@
         </w:tc>
         <w:tc>
           <w:tcPr>
-            <w:tcW w:type="dxa" w:w="603"/>
+            <w:tcW w:type="dxa" w:w="463"/>
           </w:tcPr>
           <w:p>
             <w:pPr>
@@ -2103,7 +2105,7 @@
         </w:tc>
         <w:tc>
           <w:tcPr>
-            <w:tcW w:type="dxa" w:w="964"/>
+            <w:tcW w:type="dxa" w:w="741"/>
           </w:tcPr>
           <w:p>
             <w:pPr>
@@ -2123,7 +2125,7 @@
         </w:tc>
         <w:tc>
           <w:tcPr>
-            <w:tcW w:type="dxa" w:w="603"/>
+            <w:tcW w:type="dxa" w:w="1666"/>
           </w:tcPr>
           <w:p>
             <w:pPr>
@@ -2143,7 +2145,7 @@
         </w:tc>
         <w:tc>
           <w:tcPr>
-            <w:tcW w:type="dxa" w:w="603"/>
+            <w:tcW w:type="dxa" w:w="1666"/>
           </w:tcPr>
           <w:p>
             <w:pPr>
@@ -2165,7 +2167,7 @@
       <w:tr>
         <w:tc>
           <w:tcPr>
-            <w:tcW w:type="dxa" w:w="4340"/>
+            <w:tcW w:type="dxa" w:w="3333"/>
           </w:tcPr>
           <w:p>
             <w:pPr>
@@ -2185,7 +2187,7 @@
         </w:tc>
         <w:tc>
           <w:tcPr>
-            <w:tcW w:type="dxa" w:w="723"/>
+            <w:tcW w:type="dxa" w:w="555"/>
           </w:tcPr>
           <w:p>
             <w:pPr>
@@ -2205,7 +2207,7 @@
         </w:tc>
         <w:tc>
           <w:tcPr>
-            <w:tcW w:type="dxa" w:w="1085"/>
+            <w:tcW w:type="dxa" w:w="833"/>
           </w:tcPr>
           <w:p>
             <w:pPr>
@@ -2225,7 +2227,7 @@
         </w:tc>
         <w:tc>
           <w:tcPr>
-            <w:tcW w:type="dxa" w:w="844"/>
+            <w:tcW w:type="dxa" w:w="648"/>
           </w:tcPr>
           <w:p>
             <w:pPr>
@@ -2245,7 +2247,7 @@
         </w:tc>
         <w:tc>
           <w:tcPr>
-            <w:tcW w:type="dxa" w:w="603"/>
+            <w:tcW w:type="dxa" w:w="463"/>
           </w:tcPr>
           <w:p>
             <w:pPr>
@@ -2265,7 +2267,7 @@
         </w:tc>
         <w:tc>
           <w:tcPr>
-            <w:tcW w:type="dxa" w:w="603"/>
+            <w:tcW w:type="dxa" w:w="463"/>
           </w:tcPr>
           <w:p>
             <w:pPr>
@@ -2285,7 +2287,7 @@
         </w:tc>
         <w:tc>
           <w:tcPr>
-            <w:tcW w:type="dxa" w:w="964"/>
+            <w:tcW w:type="dxa" w:w="741"/>
           </w:tcPr>
           <w:p>
             <w:pPr>
@@ -2305,7 +2307,7 @@
         </w:tc>
         <w:tc>
           <w:tcPr>
-            <w:tcW w:type="dxa" w:w="603"/>
+            <w:tcW w:type="dxa" w:w="1666"/>
           </w:tcPr>
           <w:p>
             <w:pPr>
@@ -2325,7 +2327,7 @@
         </w:tc>
         <w:tc>
           <w:tcPr>
-            <w:tcW w:type="dxa" w:w="603"/>
+            <w:tcW w:type="dxa" w:w="1666"/>
           </w:tcPr>
           <w:p>
             <w:pPr>
@@ -2347,7 +2349,7 @@
       <w:tr>
         <w:tc>
           <w:tcPr>
-            <w:tcW w:type="dxa" w:w="4340"/>
+            <w:tcW w:type="dxa" w:w="3333"/>
           </w:tcPr>
           <w:p>
             <w:pPr>
@@ -2367,7 +2369,7 @@
         </w:tc>
         <w:tc>
           <w:tcPr>
-            <w:tcW w:type="dxa" w:w="723"/>
+            <w:tcW w:type="dxa" w:w="555"/>
           </w:tcPr>
           <w:p>
             <w:pPr>
@@ -2387,7 +2389,7 @@
         </w:tc>
         <w:tc>
           <w:tcPr>
-            <w:tcW w:type="dxa" w:w="1085"/>
+            <w:tcW w:type="dxa" w:w="833"/>
           </w:tcPr>
           <w:p>
             <w:pPr>
@@ -2407,7 +2409,7 @@
         </w:tc>
         <w:tc>
           <w:tcPr>
-            <w:tcW w:type="dxa" w:w="844"/>
+            <w:tcW w:type="dxa" w:w="648"/>
           </w:tcPr>
           <w:p>
             <w:pPr>
@@ -2427,7 +2429,7 @@
         </w:tc>
         <w:tc>
           <w:tcPr>
-            <w:tcW w:type="dxa" w:w="603"/>
+            <w:tcW w:type="dxa" w:w="463"/>
           </w:tcPr>
           <w:p>
             <w:pPr>
@@ -2447,7 +2449,7 @@
         </w:tc>
         <w:tc>
           <w:tcPr>
-            <w:tcW w:type="dxa" w:w="603"/>
+            <w:tcW w:type="dxa" w:w="463"/>
           </w:tcPr>
           <w:p>
             <w:pPr>
@@ -2467,7 +2469,7 @@
         </w:tc>
         <w:tc>
           <w:tcPr>
-            <w:tcW w:type="dxa" w:w="964"/>
+            <w:tcW w:type="dxa" w:w="741"/>
           </w:tcPr>
           <w:p>
             <w:pPr>
@@ -2487,7 +2489,7 @@
         </w:tc>
         <w:tc>
           <w:tcPr>
-            <w:tcW w:type="dxa" w:w="603"/>
+            <w:tcW w:type="dxa" w:w="1666"/>
           </w:tcPr>
           <w:p>
             <w:pPr>
@@ -2507,7 +2509,7 @@
         </w:tc>
         <w:tc>
           <w:tcPr>
-            <w:tcW w:type="dxa" w:w="603"/>
+            <w:tcW w:type="dxa" w:w="1666"/>
           </w:tcPr>
           <w:p>
             <w:pPr>
@@ -2529,7 +2531,7 @@
       <w:tr>
         <w:tc>
           <w:tcPr>
-            <w:tcW w:type="dxa" w:w="4340"/>
+            <w:tcW w:type="dxa" w:w="3333"/>
           </w:tcPr>
           <w:p>
             <w:pPr>
@@ -2550,7 +2552,7 @@
         </w:tc>
         <w:tc>
           <w:tcPr>
-            <w:tcW w:type="dxa" w:w="723"/>
+            <w:tcW w:type="dxa" w:w="555"/>
           </w:tcPr>
           <w:p>
             <w:pPr>
@@ -2570,7 +2572,7 @@
         </w:tc>
         <w:tc>
           <w:tcPr>
-            <w:tcW w:type="dxa" w:w="1085"/>
+            <w:tcW w:type="dxa" w:w="833"/>
           </w:tcPr>
           <w:p>
             <w:pPr>
@@ -2590,7 +2592,7 @@
         </w:tc>
         <w:tc>
           <w:tcPr>
-            <w:tcW w:type="dxa" w:w="844"/>
+            <w:tcW w:type="dxa" w:w="648"/>
           </w:tcPr>
           <w:p>
             <w:pPr>
@@ -2610,7 +2612,7 @@
         </w:tc>
         <w:tc>
           <w:tcPr>
-            <w:tcW w:type="dxa" w:w="603"/>
+            <w:tcW w:type="dxa" w:w="463"/>
           </w:tcPr>
           <w:p>
             <w:pPr>
@@ -2630,7 +2632,7 @@
         </w:tc>
         <w:tc>
           <w:tcPr>
-            <w:tcW w:type="dxa" w:w="603"/>
+            <w:tcW w:type="dxa" w:w="463"/>
           </w:tcPr>
           <w:p>
             <w:pPr>
@@ -2650,7 +2652,7 @@
         </w:tc>
         <w:tc>
           <w:tcPr>
-            <w:tcW w:type="dxa" w:w="964"/>
+            <w:tcW w:type="dxa" w:w="741"/>
           </w:tcPr>
           <w:p>
             <w:pPr>
@@ -2671,7 +2673,7 @@
         </w:tc>
         <w:tc>
           <w:tcPr>
-            <w:tcW w:type="dxa" w:w="603"/>
+            <w:tcW w:type="dxa" w:w="1666"/>
           </w:tcPr>
           <w:p>
             <w:pPr>
@@ -2691,7 +2693,7 @@
         </w:tc>
         <w:tc>
           <w:tcPr>
-            <w:tcW w:type="dxa" w:w="603"/>
+            <w:tcW w:type="dxa" w:w="1666"/>
           </w:tcPr>
           <w:p>
             <w:pPr>
@@ -2740,7 +2742,7 @@
           <w:rFonts w:ascii="Times New Roman" w:hAnsi="Times New Roman"/>
           <w:sz w:val="20"/>
         </w:rPr>
-        <w:t>Table I summarises all systems. Our system achieves the highest emotion validation (36.7%) and the second-highest WASSA and AI-judge scores, behind only the 7.6B single model. The fine-tuned model reproduces the questioning habit of ED listeners, averaging 7.07 questions and 200.7 words per reply, and fails every rule. Retrieval augmentation lowered the initial pipeline's rule adherence from 63.7% to 43.7%, likely because the retrieved human replies model the multi-question behaviour that the rules prohibit.</w:t>
+        <w:t>Table I summarises all systems. Our system achieves the highest emotion validation (36.7%) and the second-highest WASSA and AI-judge scores, behind only the 7.6B single model. The fine-tuned model learns the style of ED listeners: 10-word replies that usually ask a question but rarely acknowledge the feeling (30.0%), meeting all rules in 22.3% of cases. Retrieval augmentation lowered the initial pipeline's rule adherence from 63.7% to 43.7%, as the retrieved listener replies model the same style.</w:t>
       </w:r>
     </w:p>
     <w:p>
@@ -4146,7 +4148,7 @@
           <w:rFonts w:ascii="Times New Roman" w:hAnsi="Times New Roman"/>
           <w:sz w:val="20"/>
         </w:rPr>
-        <w:t xml:space="preserve">The two judges agree with each other at Spearman ρ = 0.73 for empathy and 0.74 overall across 448 replies, and rank the seven systems identically except for exchanging our system and top-1 Phi, whose scores differ by 0.03. At the system level, WASSA ranks the seven systems in nearly the same order as the judges (ρ = 0.96). </w:t>
+        <w:t xml:space="preserve">The two judges agree with each other at Spearman ρ = 0.60 for empathy and overall across 384 replies of six systems, and rank them identically except for exchanging our system and top-1 Phi, whose scores differ by 0.03. At the system level, WASSA ranks the systems in nearly the same order as the judges (ρ = 0.94). </w:t>
       </w:r>
       <w:r>
         <w:rPr>

</xml_diff>

<commit_message>
Conference paper: remove human evaluation (study not complete before deadline)
Human study moved to limitations and future work; fine-tuned baseline
judge cells marked n/a with a note, as Nemotron judging is incomplete.

Co-Authored-By: Claude Opus 5 (1M context) <noreply@anthropic.com>
</commit_message>
<xml_diff>
--- a/ICCIT format writing/paper.docx
+++ b/ICCIT format writing/paper.docx
@@ -62,7 +62,7 @@
           <w:b/>
           <w:sz w:val="18"/>
         </w:rPr>
-        <w:t>Small language models that run on local hardware are attractive for emotionally supportive conversation, because a user's disclosure never has to leave the device. It is unclear, however, whether such models benefit from a separate emotion detector or should simply be prompted to recognise the emotion and respond in one step. We present a controlled study on the EmpatheticDialogues benchmark in which every system uses the same 300 test conversations, the same decoding settings and a single 8 GB GPU. Our decoupled system passes the three most probable of 32 emotions from a RoBERTa-base detector (50.3% top-1 accuracy), together with emotion-specific guidance and attention-derived cue words, to a 4-bit Phi-4-mini generator. We evaluate replies with rule adherence, the WASSA 2024 empathy classifier, emotion validation, a blind two-judge LLM panel and a human forced-choice study, using paired tests with Holm correction. The decoupled system (4.0B parameters) is significantly more empathetic and emotionally faithful than a 1.5B single model, but a 7.6B single model remains stronger on rule adherence and empathy; with 52% of its parameters and 38% less GPU memory, at a similar response time, our system reaches 97.5% of its overall AI-judge score. Three analyses show that detection accuracy is not the bottleneck: incorrect labels do not degrade replies, a more accurate detector brings no gain, and the generator's own emotion choice is less accurate than the detector's yet yields better replies. The benefit comes from how the detected emotion is used rather than how accurately it is detected.</w:t>
+        <w:t>Small language models that run on local hardware are attractive for emotionally supportive conversation, because a user's disclosure never has to leave the device. It is unclear, however, whether such models benefit from a separate emotion detector or should simply be prompted to recognise the emotion and respond in one step. We present a controlled study on the EmpatheticDialogues benchmark in which every system uses the same 300 test conversations, the same decoding settings and a single 8 GB GPU. Our decoupled system passes the three most probable of 32 emotions from a RoBERTa-base detector (50.3% top-1 accuracy), together with emotion-specific guidance and attention-derived cue words, to a 4-bit Phi-4-mini generator. We evaluate replies with rule adherence, the WASSA 2024 empathy classifier, emotion validation and a blind two-judge LLM panel, using paired tests with Holm correction. The decoupled system (4.0B parameters) is significantly more empathetic and emotionally faithful than a 1.5B single model, but a 7.6B single model remains stronger on rule adherence and empathy; with 52% of its parameters and 38% less GPU memory, at a similar response time, our system reaches 97.5% of its overall AI-judge score. Three analyses show that detection accuracy is not the bottleneck: incorrect labels do not degrade replies, a more accurate detector brings no gain, and the generator's own emotion choice is less accurate than the detector's yet yields better replies. The benefit comes from how the detected emotion is used rather than how accurately it is detected.</w:t>
       </w:r>
     </w:p>
     <w:p>
@@ -262,7 +262,7 @@
           <w:rFonts w:ascii="Times New Roman" w:hAnsi="Times New Roman"/>
           <w:sz w:val="20"/>
         </w:rPr>
-        <w:t>A multi-signal evaluation (rule adherence, WASSA empathy, emotion validation, a blind LLM-judge panel and human preference) with paired significance tests and correction for multiple comparisons, including negative results for retrieval augmentation and fine-tuning.</w:t>
+        <w:t>A multi-signal evaluation (rule adherence, WASSA empathy, emotion validation and a blind LLM-judge panel) with paired significance tests and correction for multiple comparisons, including negative results for retrieval augmentation and fine-tuning.</w:t>
       </w:r>
     </w:p>
     <w:p>
@@ -907,22 +907,7 @@
           <w:rFonts w:ascii="Times New Roman" w:hAnsi="Times New Roman"/>
           <w:sz w:val="20"/>
         </w:rPr>
-        <w:t xml:space="preserve">: Nemotron 3 Ultra and gpt-oss-120b, from developers unrelated to our models [15], score each reply blind from 1 to 10 for empathy, relevance and safety at temperature 0; overall is the mean of the three. Judges are applied to a stratified subset of 64 conversations (the shortest and longest for each emotion). A third planned judge, Mistral Large, became unavailable before the final systems were judged; on the 320 replies it did score, the two- and three-judge averages correlate at Spearman ρ = 0.98 with identical system rankings. (5) </w:t>
-      </w:r>
-      <w:r>
-        <w:rPr>
-          <w:rFonts w:ascii="Times New Roman" w:hAnsi="Times New Roman"/>
-          <w:i/>
-          <w:sz w:val="20"/>
-        </w:rPr>
-        <w:t>Human evaluation</w:t>
-      </w:r>
-      <w:r>
-        <w:rPr>
-          <w:rFonts w:ascii="Times New Roman" w:hAnsi="Times New Roman"/>
-          <w:sz w:val="20"/>
-        </w:rPr>
-        <w:t>: a three-way forced choice between our system and the two single models on 13 situations, including two attention checks.</w:t>
+        <w:t>: Nemotron 3 Ultra and gpt-oss-120b, from developers unrelated to our models [15], score each reply blind from 1 to 10 for empathy, relevance and safety at temperature 0; overall is the mean of the three. Judges are applied to a stratified subset of 64 conversations (the shortest and longest for each emotion). A third planned judge, Mistral Large, became unavailable before the final systems were judged; on the 320 replies it did score, the two- and three-judge averages correlate at Spearman ρ = 0.98 with identical system rankings.</w:t>
       </w:r>
     </w:p>
     <w:p>
@@ -1034,7 +1019,7 @@
           <w:rFonts w:ascii="Times New Roman" w:hAnsi="Times New Roman"/>
           <w:sz w:val="16"/>
         </w:rPr>
-        <w:t>Results on 300 ED test conversations (judge scores on the 64-conversation subset). Params: total parameters in billions. Rules: replies satisfying all three rules. Val.: emotion validation. Emp./All: AI-judge empathy and overall (1-10).</w:t>
+        <w:t>Results on 300 ED test conversations (judge scores on the 64-conversation subset). Params: total parameters in billions. Rules: replies satisfying all three rules. Val.: emotion validation. Emp./All: AI-judge empathy and overall (1-10); n/a = judging of this baseline was not complete at submission.</w:t>
       </w:r>
     </w:p>
     <w:tbl>
@@ -1059,7 +1044,7 @@
       <w:tr>
         <w:tc>
           <w:tcPr>
-            <w:tcW w:type="dxa" w:w="3333"/>
+            <w:tcW w:type="dxa" w:w="4340"/>
           </w:tcPr>
           <w:p>
             <w:pPr>
@@ -1080,7 +1065,7 @@
         </w:tc>
         <w:tc>
           <w:tcPr>
-            <w:tcW w:type="dxa" w:w="555"/>
+            <w:tcW w:type="dxa" w:w="723"/>
           </w:tcPr>
           <w:p>
             <w:pPr>
@@ -1101,7 +1086,7 @@
         </w:tc>
         <w:tc>
           <w:tcPr>
-            <w:tcW w:type="dxa" w:w="833"/>
+            <w:tcW w:type="dxa" w:w="1085"/>
           </w:tcPr>
           <w:p>
             <w:pPr>
@@ -1122,7 +1107,7 @@
         </w:tc>
         <w:tc>
           <w:tcPr>
-            <w:tcW w:type="dxa" w:w="648"/>
+            <w:tcW w:type="dxa" w:w="844"/>
           </w:tcPr>
           <w:p>
             <w:pPr>
@@ -1143,7 +1128,7 @@
         </w:tc>
         <w:tc>
           <w:tcPr>
-            <w:tcW w:type="dxa" w:w="463"/>
+            <w:tcW w:type="dxa" w:w="603"/>
           </w:tcPr>
           <w:p>
             <w:pPr>
@@ -1164,7 +1149,7 @@
         </w:tc>
         <w:tc>
           <w:tcPr>
-            <w:tcW w:type="dxa" w:w="463"/>
+            <w:tcW w:type="dxa" w:w="603"/>
           </w:tcPr>
           <w:p>
             <w:pPr>
@@ -1185,7 +1170,7 @@
         </w:tc>
         <w:tc>
           <w:tcPr>
-            <w:tcW w:type="dxa" w:w="741"/>
+            <w:tcW w:type="dxa" w:w="964"/>
           </w:tcPr>
           <w:p>
             <w:pPr>
@@ -1206,7 +1191,7 @@
         </w:tc>
         <w:tc>
           <w:tcPr>
-            <w:tcW w:type="dxa" w:w="1666"/>
+            <w:tcW w:type="dxa" w:w="603"/>
           </w:tcPr>
           <w:p>
             <w:pPr>
@@ -1227,7 +1212,7 @@
         </w:tc>
         <w:tc>
           <w:tcPr>
-            <w:tcW w:type="dxa" w:w="1666"/>
+            <w:tcW w:type="dxa" w:w="603"/>
           </w:tcPr>
           <w:p>
             <w:pPr>
@@ -1250,7 +1235,7 @@
       <w:tr>
         <w:tc>
           <w:tcPr>
-            <w:tcW w:type="dxa" w:w="3333"/>
+            <w:tcW w:type="dxa" w:w="4340"/>
           </w:tcPr>
           <w:p>
             <w:pPr>
@@ -1270,7 +1255,7 @@
         </w:tc>
         <w:tc>
           <w:tcPr>
-            <w:tcW w:type="dxa" w:w="555"/>
+            <w:tcW w:type="dxa" w:w="723"/>
           </w:tcPr>
           <w:p>
             <w:pPr>
@@ -1290,7 +1275,7 @@
         </w:tc>
         <w:tc>
           <w:tcPr>
-            <w:tcW w:type="dxa" w:w="833"/>
+            <w:tcW w:type="dxa" w:w="1085"/>
           </w:tcPr>
           <w:p>
             <w:pPr>
@@ -1310,7 +1295,7 @@
         </w:tc>
         <w:tc>
           <w:tcPr>
-            <w:tcW w:type="dxa" w:w="648"/>
+            <w:tcW w:type="dxa" w:w="844"/>
           </w:tcPr>
           <w:p>
             <w:pPr>
@@ -1330,7 +1315,7 @@
         </w:tc>
         <w:tc>
           <w:tcPr>
-            <w:tcW w:type="dxa" w:w="463"/>
+            <w:tcW w:type="dxa" w:w="603"/>
           </w:tcPr>
           <w:p>
             <w:pPr>
@@ -1350,7 +1335,7 @@
         </w:tc>
         <w:tc>
           <w:tcPr>
-            <w:tcW w:type="dxa" w:w="463"/>
+            <w:tcW w:type="dxa" w:w="603"/>
           </w:tcPr>
           <w:p>
             <w:pPr>
@@ -1370,7 +1355,7 @@
         </w:tc>
         <w:tc>
           <w:tcPr>
-            <w:tcW w:type="dxa" w:w="741"/>
+            <w:tcW w:type="dxa" w:w="964"/>
           </w:tcPr>
           <w:p>
             <w:pPr>
@@ -1390,7 +1375,7 @@
         </w:tc>
         <w:tc>
           <w:tcPr>
-            <w:tcW w:type="dxa" w:w="1666"/>
+            <w:tcW w:type="dxa" w:w="603"/>
           </w:tcPr>
           <w:p>
             <w:pPr>
@@ -1410,7 +1395,7 @@
         </w:tc>
         <w:tc>
           <w:tcPr>
-            <w:tcW w:type="dxa" w:w="1666"/>
+            <w:tcW w:type="dxa" w:w="603"/>
           </w:tcPr>
           <w:p>
             <w:pPr>
@@ -1432,7 +1417,7 @@
       <w:tr>
         <w:tc>
           <w:tcPr>
-            <w:tcW w:type="dxa" w:w="3333"/>
+            <w:tcW w:type="dxa" w:w="4340"/>
           </w:tcPr>
           <w:p>
             <w:pPr>
@@ -1452,7 +1437,7 @@
         </w:tc>
         <w:tc>
           <w:tcPr>
-            <w:tcW w:type="dxa" w:w="555"/>
+            <w:tcW w:type="dxa" w:w="723"/>
           </w:tcPr>
           <w:p>
             <w:pPr>
@@ -1472,7 +1457,7 @@
         </w:tc>
         <w:tc>
           <w:tcPr>
-            <w:tcW w:type="dxa" w:w="833"/>
+            <w:tcW w:type="dxa" w:w="1085"/>
           </w:tcPr>
           <w:p>
             <w:pPr>
@@ -1492,7 +1477,7 @@
         </w:tc>
         <w:tc>
           <w:tcPr>
-            <w:tcW w:type="dxa" w:w="648"/>
+            <w:tcW w:type="dxa" w:w="844"/>
           </w:tcPr>
           <w:p>
             <w:pPr>
@@ -1512,7 +1497,7 @@
         </w:tc>
         <w:tc>
           <w:tcPr>
-            <w:tcW w:type="dxa" w:w="463"/>
+            <w:tcW w:type="dxa" w:w="603"/>
           </w:tcPr>
           <w:p>
             <w:pPr>
@@ -1532,7 +1517,7 @@
         </w:tc>
         <w:tc>
           <w:tcPr>
-            <w:tcW w:type="dxa" w:w="463"/>
+            <w:tcW w:type="dxa" w:w="603"/>
           </w:tcPr>
           <w:p>
             <w:pPr>
@@ -1552,7 +1537,7 @@
         </w:tc>
         <w:tc>
           <w:tcPr>
-            <w:tcW w:type="dxa" w:w="741"/>
+            <w:tcW w:type="dxa" w:w="964"/>
           </w:tcPr>
           <w:p>
             <w:pPr>
@@ -1572,7 +1557,7 @@
         </w:tc>
         <w:tc>
           <w:tcPr>
-            <w:tcW w:type="dxa" w:w="1666"/>
+            <w:tcW w:type="dxa" w:w="603"/>
           </w:tcPr>
           <w:p>
             <w:pPr>
@@ -1585,15 +1570,14 @@
               <w:rPr>
                 <w:rFonts w:ascii="Times New Roman" w:hAnsi="Times New Roman"/>
                 <w:sz w:val="16"/>
-                <w:highlight w:val="yellow"/>
               </w:rPr>
-              <w:t>PENDING: judge</w:t>
+              <w:t>n/a</w:t>
             </w:r>
           </w:p>
         </w:tc>
         <w:tc>
           <w:tcPr>
-            <w:tcW w:type="dxa" w:w="1666"/>
+            <w:tcW w:type="dxa" w:w="603"/>
           </w:tcPr>
           <w:p>
             <w:pPr>
@@ -1606,9 +1590,8 @@
               <w:rPr>
                 <w:rFonts w:ascii="Times New Roman" w:hAnsi="Times New Roman"/>
                 <w:sz w:val="16"/>
-                <w:highlight w:val="yellow"/>
               </w:rPr>
-              <w:t>PENDING: judge</w:t>
+              <w:t>n/a</w:t>
             </w:r>
           </w:p>
         </w:tc>
@@ -1616,7 +1599,7 @@
       <w:tr>
         <w:tc>
           <w:tcPr>
-            <w:tcW w:type="dxa" w:w="3333"/>
+            <w:tcW w:type="dxa" w:w="4340"/>
           </w:tcPr>
           <w:p>
             <w:pPr>
@@ -1636,7 +1619,7 @@
         </w:tc>
         <w:tc>
           <w:tcPr>
-            <w:tcW w:type="dxa" w:w="555"/>
+            <w:tcW w:type="dxa" w:w="723"/>
           </w:tcPr>
           <w:p>
             <w:pPr>
@@ -1656,7 +1639,7 @@
         </w:tc>
         <w:tc>
           <w:tcPr>
-            <w:tcW w:type="dxa" w:w="833"/>
+            <w:tcW w:type="dxa" w:w="1085"/>
           </w:tcPr>
           <w:p>
             <w:pPr>
@@ -1676,7 +1659,7 @@
         </w:tc>
         <w:tc>
           <w:tcPr>
-            <w:tcW w:type="dxa" w:w="648"/>
+            <w:tcW w:type="dxa" w:w="844"/>
           </w:tcPr>
           <w:p>
             <w:pPr>
@@ -1696,7 +1679,7 @@
         </w:tc>
         <w:tc>
           <w:tcPr>
-            <w:tcW w:type="dxa" w:w="463"/>
+            <w:tcW w:type="dxa" w:w="603"/>
           </w:tcPr>
           <w:p>
             <w:pPr>
@@ -1716,7 +1699,7 @@
         </w:tc>
         <w:tc>
           <w:tcPr>
-            <w:tcW w:type="dxa" w:w="463"/>
+            <w:tcW w:type="dxa" w:w="603"/>
           </w:tcPr>
           <w:p>
             <w:pPr>
@@ -1736,7 +1719,7 @@
         </w:tc>
         <w:tc>
           <w:tcPr>
-            <w:tcW w:type="dxa" w:w="741"/>
+            <w:tcW w:type="dxa" w:w="964"/>
           </w:tcPr>
           <w:p>
             <w:pPr>
@@ -1756,7 +1739,7 @@
         </w:tc>
         <w:tc>
           <w:tcPr>
-            <w:tcW w:type="dxa" w:w="1666"/>
+            <w:tcW w:type="dxa" w:w="603"/>
           </w:tcPr>
           <w:p>
             <w:pPr>
@@ -1776,7 +1759,7 @@
         </w:tc>
         <w:tc>
           <w:tcPr>
-            <w:tcW w:type="dxa" w:w="1666"/>
+            <w:tcW w:type="dxa" w:w="603"/>
           </w:tcPr>
           <w:p>
             <w:pPr>
@@ -1798,7 +1781,7 @@
       <w:tr>
         <w:tc>
           <w:tcPr>
-            <w:tcW w:type="dxa" w:w="3333"/>
+            <w:tcW w:type="dxa" w:w="4340"/>
           </w:tcPr>
           <w:p>
             <w:pPr>
@@ -1818,7 +1801,7 @@
         </w:tc>
         <w:tc>
           <w:tcPr>
-            <w:tcW w:type="dxa" w:w="555"/>
+            <w:tcW w:type="dxa" w:w="723"/>
           </w:tcPr>
           <w:p>
             <w:pPr>
@@ -1838,7 +1821,7 @@
         </w:tc>
         <w:tc>
           <w:tcPr>
-            <w:tcW w:type="dxa" w:w="833"/>
+            <w:tcW w:type="dxa" w:w="1085"/>
           </w:tcPr>
           <w:p>
             <w:pPr>
@@ -1859,7 +1842,7 @@
         </w:tc>
         <w:tc>
           <w:tcPr>
-            <w:tcW w:type="dxa" w:w="648"/>
+            <w:tcW w:type="dxa" w:w="844"/>
           </w:tcPr>
           <w:p>
             <w:pPr>
@@ -1880,7 +1863,7 @@
         </w:tc>
         <w:tc>
           <w:tcPr>
-            <w:tcW w:type="dxa" w:w="463"/>
+            <w:tcW w:type="dxa" w:w="603"/>
           </w:tcPr>
           <w:p>
             <w:pPr>
@@ -1900,7 +1883,7 @@
         </w:tc>
         <w:tc>
           <w:tcPr>
-            <w:tcW w:type="dxa" w:w="463"/>
+            <w:tcW w:type="dxa" w:w="603"/>
           </w:tcPr>
           <w:p>
             <w:pPr>
@@ -1921,7 +1904,7 @@
         </w:tc>
         <w:tc>
           <w:tcPr>
-            <w:tcW w:type="dxa" w:w="741"/>
+            <w:tcW w:type="dxa" w:w="964"/>
           </w:tcPr>
           <w:p>
             <w:pPr>
@@ -1941,7 +1924,7 @@
         </w:tc>
         <w:tc>
           <w:tcPr>
-            <w:tcW w:type="dxa" w:w="1666"/>
+            <w:tcW w:type="dxa" w:w="603"/>
           </w:tcPr>
           <w:p>
             <w:pPr>
@@ -1962,7 +1945,7 @@
         </w:tc>
         <w:tc>
           <w:tcPr>
-            <w:tcW w:type="dxa" w:w="1666"/>
+            <w:tcW w:type="dxa" w:w="603"/>
           </w:tcPr>
           <w:p>
             <w:pPr>
@@ -1985,7 +1968,7 @@
       <w:tr>
         <w:tc>
           <w:tcPr>
-            <w:tcW w:type="dxa" w:w="3333"/>
+            <w:tcW w:type="dxa" w:w="4340"/>
           </w:tcPr>
           <w:p>
             <w:pPr>
@@ -2005,7 +1988,7 @@
         </w:tc>
         <w:tc>
           <w:tcPr>
-            <w:tcW w:type="dxa" w:w="555"/>
+            <w:tcW w:type="dxa" w:w="723"/>
           </w:tcPr>
           <w:p>
             <w:pPr>
@@ -2025,7 +2008,7 @@
         </w:tc>
         <w:tc>
           <w:tcPr>
-            <w:tcW w:type="dxa" w:w="833"/>
+            <w:tcW w:type="dxa" w:w="1085"/>
           </w:tcPr>
           <w:p>
             <w:pPr>
@@ -2045,7 +2028,7 @@
         </w:tc>
         <w:tc>
           <w:tcPr>
-            <w:tcW w:type="dxa" w:w="648"/>
+            <w:tcW w:type="dxa" w:w="844"/>
           </w:tcPr>
           <w:p>
             <w:pPr>
@@ -2065,7 +2048,7 @@
         </w:tc>
         <w:tc>
           <w:tcPr>
-            <w:tcW w:type="dxa" w:w="463"/>
+            <w:tcW w:type="dxa" w:w="603"/>
           </w:tcPr>
           <w:p>
             <w:pPr>
@@ -2085,7 +2068,7 @@
         </w:tc>
         <w:tc>
           <w:tcPr>
-            <w:tcW w:type="dxa" w:w="463"/>
+            <w:tcW w:type="dxa" w:w="603"/>
           </w:tcPr>
           <w:p>
             <w:pPr>
@@ -2105,7 +2088,7 @@
         </w:tc>
         <w:tc>
           <w:tcPr>
-            <w:tcW w:type="dxa" w:w="741"/>
+            <w:tcW w:type="dxa" w:w="964"/>
           </w:tcPr>
           <w:p>
             <w:pPr>
@@ -2125,7 +2108,7 @@
         </w:tc>
         <w:tc>
           <w:tcPr>
-            <w:tcW w:type="dxa" w:w="1666"/>
+            <w:tcW w:type="dxa" w:w="603"/>
           </w:tcPr>
           <w:p>
             <w:pPr>
@@ -2145,7 +2128,7 @@
         </w:tc>
         <w:tc>
           <w:tcPr>
-            <w:tcW w:type="dxa" w:w="1666"/>
+            <w:tcW w:type="dxa" w:w="603"/>
           </w:tcPr>
           <w:p>
             <w:pPr>
@@ -2167,7 +2150,7 @@
       <w:tr>
         <w:tc>
           <w:tcPr>
-            <w:tcW w:type="dxa" w:w="3333"/>
+            <w:tcW w:type="dxa" w:w="4340"/>
           </w:tcPr>
           <w:p>
             <w:pPr>
@@ -2187,7 +2170,7 @@
         </w:tc>
         <w:tc>
           <w:tcPr>
-            <w:tcW w:type="dxa" w:w="555"/>
+            <w:tcW w:type="dxa" w:w="723"/>
           </w:tcPr>
           <w:p>
             <w:pPr>
@@ -2207,7 +2190,7 @@
         </w:tc>
         <w:tc>
           <w:tcPr>
-            <w:tcW w:type="dxa" w:w="833"/>
+            <w:tcW w:type="dxa" w:w="1085"/>
           </w:tcPr>
           <w:p>
             <w:pPr>
@@ -2227,7 +2210,7 @@
         </w:tc>
         <w:tc>
           <w:tcPr>
-            <w:tcW w:type="dxa" w:w="648"/>
+            <w:tcW w:type="dxa" w:w="844"/>
           </w:tcPr>
           <w:p>
             <w:pPr>
@@ -2247,7 +2230,7 @@
         </w:tc>
         <w:tc>
           <w:tcPr>
-            <w:tcW w:type="dxa" w:w="463"/>
+            <w:tcW w:type="dxa" w:w="603"/>
           </w:tcPr>
           <w:p>
             <w:pPr>
@@ -2267,7 +2250,7 @@
         </w:tc>
         <w:tc>
           <w:tcPr>
-            <w:tcW w:type="dxa" w:w="463"/>
+            <w:tcW w:type="dxa" w:w="603"/>
           </w:tcPr>
           <w:p>
             <w:pPr>
@@ -2287,7 +2270,7 @@
         </w:tc>
         <w:tc>
           <w:tcPr>
-            <w:tcW w:type="dxa" w:w="741"/>
+            <w:tcW w:type="dxa" w:w="964"/>
           </w:tcPr>
           <w:p>
             <w:pPr>
@@ -2307,7 +2290,7 @@
         </w:tc>
         <w:tc>
           <w:tcPr>
-            <w:tcW w:type="dxa" w:w="1666"/>
+            <w:tcW w:type="dxa" w:w="603"/>
           </w:tcPr>
           <w:p>
             <w:pPr>
@@ -2327,7 +2310,7 @@
         </w:tc>
         <w:tc>
           <w:tcPr>
-            <w:tcW w:type="dxa" w:w="1666"/>
+            <w:tcW w:type="dxa" w:w="603"/>
           </w:tcPr>
           <w:p>
             <w:pPr>
@@ -2349,7 +2332,7 @@
       <w:tr>
         <w:tc>
           <w:tcPr>
-            <w:tcW w:type="dxa" w:w="3333"/>
+            <w:tcW w:type="dxa" w:w="4340"/>
           </w:tcPr>
           <w:p>
             <w:pPr>
@@ -2369,7 +2352,7 @@
         </w:tc>
         <w:tc>
           <w:tcPr>
-            <w:tcW w:type="dxa" w:w="555"/>
+            <w:tcW w:type="dxa" w:w="723"/>
           </w:tcPr>
           <w:p>
             <w:pPr>
@@ -2389,7 +2372,7 @@
         </w:tc>
         <w:tc>
           <w:tcPr>
-            <w:tcW w:type="dxa" w:w="833"/>
+            <w:tcW w:type="dxa" w:w="1085"/>
           </w:tcPr>
           <w:p>
             <w:pPr>
@@ -2409,7 +2392,7 @@
         </w:tc>
         <w:tc>
           <w:tcPr>
-            <w:tcW w:type="dxa" w:w="648"/>
+            <w:tcW w:type="dxa" w:w="844"/>
           </w:tcPr>
           <w:p>
             <w:pPr>
@@ -2429,7 +2412,7 @@
         </w:tc>
         <w:tc>
           <w:tcPr>
-            <w:tcW w:type="dxa" w:w="463"/>
+            <w:tcW w:type="dxa" w:w="603"/>
           </w:tcPr>
           <w:p>
             <w:pPr>
@@ -2449,7 +2432,7 @@
         </w:tc>
         <w:tc>
           <w:tcPr>
-            <w:tcW w:type="dxa" w:w="463"/>
+            <w:tcW w:type="dxa" w:w="603"/>
           </w:tcPr>
           <w:p>
             <w:pPr>
@@ -2469,7 +2452,7 @@
         </w:tc>
         <w:tc>
           <w:tcPr>
-            <w:tcW w:type="dxa" w:w="741"/>
+            <w:tcW w:type="dxa" w:w="964"/>
           </w:tcPr>
           <w:p>
             <w:pPr>
@@ -2489,7 +2472,7 @@
         </w:tc>
         <w:tc>
           <w:tcPr>
-            <w:tcW w:type="dxa" w:w="1666"/>
+            <w:tcW w:type="dxa" w:w="603"/>
           </w:tcPr>
           <w:p>
             <w:pPr>
@@ -2509,7 +2492,7 @@
         </w:tc>
         <w:tc>
           <w:tcPr>
-            <w:tcW w:type="dxa" w:w="1666"/>
+            <w:tcW w:type="dxa" w:w="603"/>
           </w:tcPr>
           <w:p>
             <w:pPr>
@@ -2531,7 +2514,7 @@
       <w:tr>
         <w:tc>
           <w:tcPr>
-            <w:tcW w:type="dxa" w:w="3333"/>
+            <w:tcW w:type="dxa" w:w="4340"/>
           </w:tcPr>
           <w:p>
             <w:pPr>
@@ -2552,7 +2535,7 @@
         </w:tc>
         <w:tc>
           <w:tcPr>
-            <w:tcW w:type="dxa" w:w="555"/>
+            <w:tcW w:type="dxa" w:w="723"/>
           </w:tcPr>
           <w:p>
             <w:pPr>
@@ -2572,7 +2555,7 @@
         </w:tc>
         <w:tc>
           <w:tcPr>
-            <w:tcW w:type="dxa" w:w="833"/>
+            <w:tcW w:type="dxa" w:w="1085"/>
           </w:tcPr>
           <w:p>
             <w:pPr>
@@ -2592,7 +2575,7 @@
         </w:tc>
         <w:tc>
           <w:tcPr>
-            <w:tcW w:type="dxa" w:w="648"/>
+            <w:tcW w:type="dxa" w:w="844"/>
           </w:tcPr>
           <w:p>
             <w:pPr>
@@ -2612,7 +2595,7 @@
         </w:tc>
         <w:tc>
           <w:tcPr>
-            <w:tcW w:type="dxa" w:w="463"/>
+            <w:tcW w:type="dxa" w:w="603"/>
           </w:tcPr>
           <w:p>
             <w:pPr>
@@ -2632,7 +2615,7 @@
         </w:tc>
         <w:tc>
           <w:tcPr>
-            <w:tcW w:type="dxa" w:w="463"/>
+            <w:tcW w:type="dxa" w:w="603"/>
           </w:tcPr>
           <w:p>
             <w:pPr>
@@ -2652,7 +2635,7 @@
         </w:tc>
         <w:tc>
           <w:tcPr>
-            <w:tcW w:type="dxa" w:w="741"/>
+            <w:tcW w:type="dxa" w:w="964"/>
           </w:tcPr>
           <w:p>
             <w:pPr>
@@ -2673,7 +2656,7 @@
         </w:tc>
         <w:tc>
           <w:tcPr>
-            <w:tcW w:type="dxa" w:w="1666"/>
+            <w:tcW w:type="dxa" w:w="603"/>
           </w:tcPr>
           <w:p>
             <w:pPr>
@@ -2693,7 +2676,7 @@
         </w:tc>
         <w:tc>
           <w:tcPr>
-            <w:tcW w:type="dxa" w:w="1666"/>
+            <w:tcW w:type="dxa" w:w="603"/>
           </w:tcPr>
           <w:p>
             <w:pPr>
@@ -4134,7 +4117,7 @@
           <w:i/>
           <w:sz w:val="20"/>
         </w:rPr>
-        <w:t>E. Judge Agreement and Human Evaluation</w:t>
+        <w:t>E. Judge Agreement</w:t>
       </w:r>
     </w:p>
     <w:p>
@@ -4148,15 +4131,7 @@
           <w:rFonts w:ascii="Times New Roman" w:hAnsi="Times New Roman"/>
           <w:sz w:val="20"/>
         </w:rPr>
-        <w:t xml:space="preserve">The two judges agree with each other at Spearman ρ = 0.60 for empathy and overall across 384 replies of six systems, and rank them identically except for exchanging our system and top-1 Phi, whose scores differ by 0.03. At the system level, WASSA ranks the systems in nearly the same order as the judges (ρ = 0.94). </w:t>
-      </w:r>
-      <w:r>
-        <w:rPr>
-          <w:rFonts w:ascii="Times New Roman" w:hAnsi="Times New Roman"/>
-          <w:sz w:val="20"/>
-          <w:highlight w:val="yellow"/>
-        </w:rPr>
-        <w:t>PENDING: human evaluation results: number of valid participants after attention checks; selection rate of each system against chance (33.3%) with binomial tests; Fleiss' kappa; agreement between the human majority choice and the judges' top system.</w:t>
+        <w:t>The judged systems exclude the fine-tuned baseline, whose judging was still in progress. The two judges agree with each other at Spearman ρ = 0.60 for empathy and overall across 384 replies of six systems, and rank them identically except for exchanging our system and top-1 Phi, whose scores differ by 0.03. At the system level, WASSA ranks the systems in nearly the same order as the judges (ρ = 0.94).</w:t>
       </w:r>
     </w:p>
     <w:p>
@@ -4264,7 +4239,7 @@
           <w:rFonts w:ascii="Times New Roman" w:hAnsi="Times New Roman"/>
           <w:sz w:val="20"/>
         </w:rPr>
-        <w:t>This study has several limitations. We did not evaluate a single-model baseline built on Phi-4-mini, so the comparison with the 1.5B single model combines decoupling, guidance and generator capacity; Section V-C separates these only with the Qwen2.5-1.5B generator. Automatic measures are proxies: the acknowledgement check is keyword-based, WASSA rewards length (Spearman ρ = 0.14-0.54 with word count within systems) and was trained on discussions of news articles [17], emotion validation uses our own detector, and LLM judges prefer longer answers [14]. Judge results rest on 64 conversations. Evaluation covers single turns in English, and resource use was measured on one GPU. Our system reuses stock phrases in 58.7% of replies.</w:t>
+        <w:t>This study has several limitations. We did not evaluate a single-model baseline built on Phi-4-mini, so the comparison with the 1.5B single model combines decoupling, guidance and generator capacity; Section V-C separates these only with the Qwen2.5-1.5B generator. Automatic measures are proxies: the acknowledgement check is keyword-based, WASSA rewards length (Spearman ρ = 0.14-0.54 with word count within systems) and was trained on discussions of news articles [17], emotion validation uses our own detector, and LLM judges prefer longer answers [14]. Judge results rest on 64 conversations. All measures reported here are automatic: a human preference study is under way but not complete, so the ranking rests on rule checks, an empathy classifier and LLM judges rather than on the judgement of people seeking support. Evaluation covers single turns in English, and resource use was measured on one GPU. Our system reuses stock phrases in 58.7% of replies.</w:t>
       </w:r>
     </w:p>
     <w:p>
@@ -4286,15 +4261,7 @@
           <w:rFonts w:ascii="Times New Roman" w:hAnsi="Times New Roman"/>
           <w:sz w:val="20"/>
         </w:rPr>
-        <w:t xml:space="preserve"> ED is used under its CC BY-NC 4.0 licence, and no data from real users was collected; only ED text was sent to the judge APIs. The label set has no category for suicidal ideation and the system has no crisis safeguard, so it must not be deployed as a mental-health service without a reviewed crisis filter and referral mechanism [33]. </w:t>
-      </w:r>
-      <w:r>
-        <w:rPr>
-          <w:rFonts w:ascii="Times New Roman" w:hAnsi="Times New Roman"/>
-          <w:sz w:val="20"/>
-          <w:highlight w:val="yellow"/>
-        </w:rPr>
-        <w:t>PENDING: statement on consent and anonymity of human-evaluation participants.</w:t>
+        <w:t xml:space="preserve"> ED is used under its CC BY-NC 4.0 licence, and no data from real users was collected; only ED text was sent to the judge APIs. The label set has no category for suicidal ideation and the system has no crisis safeguard, so it must not be deployed as a mental-health service without a reviewed crisis filter and referral mechanism [33].</w:t>
       </w:r>
     </w:p>
     <w:p>
@@ -4322,7 +4289,7 @@
           <w:rFonts w:ascii="Times New Roman" w:hAnsi="Times New Roman"/>
           <w:sz w:val="20"/>
         </w:rPr>
-        <w:t>We compared decoupled and monolithic small language models for empathetic response generation under identical data, decoding and hardware. A RoBERTa-base detector feeding its top-3 emotions and emotion-specific guidance to a 4-bit Phi-4-mini produces replies that are significantly more empathetic and emotionally faithful than a 1.5B single model, although a 7.6B single model remains stronger. Detection accuracy is not the limiting factor; how the detected emotion is used matters more. Future work should add a Phi-4-mini single-model baseline, combine emotion-specific guidance with larger generators, and evaluate multi-turn conversations with mental-health professionals.</w:t>
+        <w:t>We compared decoupled and monolithic small language models for empathetic response generation under identical data, decoding and hardware. A RoBERTa-base detector feeding its top-3 emotions and emotion-specific guidance to a 4-bit Phi-4-mini produces replies that are significantly more empathetic and emotionally faithful than a 1.5B single model, although a 7.6B single model remains stronger. Detection accuracy is not the limiting factor; how the detected emotion is used matters more. Future work should complete the human preference study, add a Phi-4-mini single-model baseline, combine emotion-specific guidance with larger generators, and evaluate multi-turn conversations with mental-health professionals.</w:t>
       </w:r>
     </w:p>
     <w:p>

</xml_diff>

<commit_message>
Justify and test the three response rules; guard partial result files
New thesis section 5.4.8 and Table 5.28: each rule's origin (EPITOME
empathy mechanisms; counselling guidance on the question-answer trap) and
its measured within-system effect. Acknowledgement raises WASSA (+0.36),
length limit raises judged empathy (+0.65); the one-question rule is not
rewarded by either measure and is presented as a usability requirement.

Settings now register only when their output holds the full 300-conversation
sample, so a smoke-test file cannot shrink the judged sample.

Co-Authored-By: Claude Opus 5 (1M context) <noreply@anthropic.com>
</commit_message>
<xml_diff>
--- a/ICCIT format writing/paper.docx
+++ b/ICCIT format writing/paper.docx
@@ -422,7 +422,37 @@
           <w:rFonts w:ascii="Times New Roman" w:hAnsi="Times New Roman"/>
           <w:sz w:val="20"/>
         </w:rPr>
-        <w:t xml:space="preserve">Given a user's message, the system must produce a reply that satisfies three rules derived from supportive-listening practice: it (R1) acknowledges the feeling, (R2) asks exactly one question and (R3) stays within 120 words. The rules are not satisfied by imitating the data: real ED listener replies acknowledge the feeling in only 10.6% of cases and meet all three rules in 4.3%. We use the official ED train, validation and test partitions. Each conversation contributes its </w:t>
+        <w:t xml:space="preserve">Given a user's message, the system must produce a reply that satisfies three rules: it (R1) acknowledges the feeling, (R2) asks exactly one question and (R3) stays within 120 words. R1 and R2 correspond to the </w:t>
+      </w:r>
+      <w:r>
+        <w:rPr>
+          <w:rFonts w:ascii="Times New Roman" w:hAnsi="Times New Roman"/>
+          <w:i/>
+          <w:sz w:val="20"/>
+        </w:rPr>
+        <w:t>emotional reactions</w:t>
+      </w:r>
+      <w:r>
+        <w:rPr>
+          <w:rFonts w:ascii="Times New Roman" w:hAnsi="Times New Roman"/>
+          <w:sz w:val="20"/>
+        </w:rPr>
+        <w:t xml:space="preserve"> and </w:t>
+      </w:r>
+      <w:r>
+        <w:rPr>
+          <w:rFonts w:ascii="Times New Roman" w:hAnsi="Times New Roman"/>
+          <w:i/>
+          <w:sz w:val="20"/>
+        </w:rPr>
+        <w:t>explorations</w:t>
+      </w:r>
+      <w:r>
+        <w:rPr>
+          <w:rFonts w:ascii="Times New Roman" w:hAnsi="Times New Roman"/>
+          <w:sz w:val="20"/>
+        </w:rPr>
+        <w:t xml:space="preserve"> mechanisms of empathy in text-based support [18], while asking several questions is the question-answer trap that counselling guidance warns against [19]. Within systems, replies with an acknowledgement score 0.36 points higher on WASSA (p &lt; 0.001) and replies within the length limit score 0.65 points higher on judged empathy (p = 0.006); the one-question rule is not rewarded by either measure and is justified as a usability requirement. The rules are not satisfied by imitating the data: real ED listener replies acknowledge the feeling in only 10.6% of cases and meet all three rules in 4.3%. We use the official ED train, validation and test partitions. Each conversation contributes its </w:t>
       </w:r>
       <w:r>
         <w:rPr>
@@ -466,7 +496,7 @@
           <w:rFonts w:ascii="Times New Roman" w:hAnsi="Times New Roman"/>
           <w:sz w:val="20"/>
         </w:rPr>
-        <w:t xml:space="preserve">We fine-tune RoBERTa-base [18] (125M parameters) as a 32-way classifier on first utterances (learning rate 2e-5, effective batch size 16, linear warm-up over 6% of steps, early stopping on validation accuracy, at most 128 tokens). Among equally tuned base-size encoders, RoBERTa-base was comparable to ELECTRA in top-1 accuracy (50.1% against 50.2%), above BERT (48.8%), and gave the highest top-5 accuracy (85.0%); RoBERTa-large reached 53.0% but required 7x the training time. The deployed checkpoint reaches </w:t>
+        <w:t xml:space="preserve">We fine-tune RoBERTa-base [20] (125M parameters) as a 32-way classifier on first utterances (learning rate 2e-5, effective batch size 16, linear warm-up over 6% of steps, early stopping on validation accuracy, at most 128 tokens). Among equally tuned base-size encoders, RoBERTa-base was comparable to ELECTRA in top-1 accuracy (50.1% against 50.2%), above BERT (48.8%), and gave the highest top-5 accuracy (85.0%); RoBERTa-large reached 53.0% but required 7x the training time. The deployed checkpoint reaches </w:t>
       </w:r>
       <w:r>
         <w:rPr>
@@ -625,7 +655,7 @@
           <w:rFonts w:ascii="Times New Roman" w:hAnsi="Times New Roman"/>
           <w:sz w:val="20"/>
         </w:rPr>
-        <w:t xml:space="preserve">Fig. 1 shows the pipeline. The generator is Phi-4-mini-instruct [19] (3.8B) loaded with 4-bit NF4 quantisation [20]. It was selected in a bake-off against Qwen2.5-1.5B [21] and Gemma-3-4B under the same detector and prompt: Phi-4-mini gave the highest rule adherence (65.3% against 57.7% and 22.0%), whereas Gemma-3-4B exceeded the length limit in 72.3% of replies. In </w:t>
+        <w:t xml:space="preserve">Fig. 1 shows the pipeline. The generator is Phi-4-mini-instruct [21] (3.8B) loaded with 4-bit NF4 quantisation [22]. It was selected in a bake-off against Qwen2.5-1.5B [23] and Gemma-3-4B under the same detector and prompt: Phi-4-mini gave the highest rule adherence (65.3% against 57.7% and 22.0%), whereas Gemma-3-4B exceeded the length limit in 72.3% of replies. In </w:t>
       </w:r>
       <w:r>
         <w:rPr>
@@ -729,7 +759,7 @@
           <w:rFonts w:ascii="Times New Roman" w:hAnsi="Times New Roman"/>
           <w:sz w:val="20"/>
         </w:rPr>
-        <w:t xml:space="preserve">: Qwen2.5-1.5B fine-tuned end to end on ED replies with LoRA [22] (rank 16, alpha 32, learning rate 2e-4, dropout 0.1, best epoch by validation loss). </w:t>
+        <w:t xml:space="preserve">: Qwen2.5-1.5B fine-tuned end to end on ED replies with LoRA [24] (rank 16, alpha 32, learning rate 2e-4, dropout 0.1, best epoch by validation loss). </w:t>
       </w:r>
       <w:r>
         <w:rPr>
@@ -789,7 +819,7 @@
           <w:rFonts w:ascii="Times New Roman" w:hAnsi="Times New Roman"/>
           <w:sz w:val="20"/>
         </w:rPr>
-        <w:t>: our detector and generator, passing only the top-1 emotion with a generic prompt. We also tested retrieval augmentation [23] of the initial pipeline with similar ED conversations.</w:t>
+        <w:t>: our detector and generator, passing only the top-1 emotion with a generic prompt. We also tested retrieval augmentation [25] of the initial pipeline with similar ED conversations.</w:t>
       </w:r>
     </w:p>
     <w:p>
@@ -877,7 +907,7 @@
           <w:rFonts w:ascii="Times New Roman" w:hAnsi="Times New Roman"/>
           <w:sz w:val="20"/>
         </w:rPr>
-        <w:t xml:space="preserve">: the hyy33 system from the WASSA 2024 shared task [24], trained on human empathy ratings of conversation turns and correlating with them at r = 0.544 [17], mapped to a 0-10 scale. (3) </w:t>
+        <w:t xml:space="preserve">: the hyy33 system from the WASSA 2024 shared task [26], trained on human empathy ratings of conversation turns and correlating with them at r = 0.544 [17], mapped to a 0-10 scale. (3) </w:t>
       </w:r>
       <w:r>
         <w:rPr>
@@ -929,7 +959,7 @@
           <w:rFonts w:ascii="Times New Roman" w:hAnsi="Times New Roman"/>
           <w:sz w:val="20"/>
         </w:rPr>
-        <w:t xml:space="preserve"> All comparisons are paired. We use McNemar's exact test for binary measures [25], the Wilcoxon signed-rank test for scores [26] and 95% bootstrap confidence intervals from 10,000 resamples [27]. P-values are Holm-corrected [28] across the baselines compared on each measure. We call a difference significant only if the corrected p &lt; 0.05 and the interval excludes zero.</w:t>
+        <w:t xml:space="preserve"> All comparisons are paired. We use McNemar's exact test for binary measures [27], the Wilcoxon signed-rank test for scores [28] and 95% bootstrap confidence intervals from 10,000 resamples [29]. P-values are Holm-corrected [30] across the baselines compared on each measure. We call a difference significant only if the corrected p &lt; 0.05 and the interval excludes zero.</w:t>
       </w:r>
     </w:p>
     <w:p>
@@ -951,7 +981,7 @@
           <w:rFonts w:ascii="Times New Roman" w:hAnsi="Times New Roman"/>
           <w:sz w:val="20"/>
         </w:rPr>
-        <w:t xml:space="preserve"> All experiments use Python with PyTorch [29] and Hugging Face Transformers [30] on one NVIDIA RTX 4060 with 8 GB of memory.</w:t>
+        <w:t xml:space="preserve"> All experiments use Python with PyTorch [31] and Hugging Face Transformers [32] on one NVIDIA RTX 4060 with 8 GB of memory.</w:t>
       </w:r>
     </w:p>
     <w:p>
@@ -4102,7 +4132,7 @@
           <w:rFonts w:ascii="Times New Roman" w:hAnsi="Times New Roman"/>
           <w:sz w:val="20"/>
         </w:rPr>
-        <w:t>For reference, our detector reads only the first user message yet exceeds the emotion accuracy reported by joint generation models that use the full dialogue context (30.6-48.3%) [2], [12], [31]. It achieves higher accuracy with less input for two reasons. First, it is initialised from RoBERTa, pre-trained on about 160 GB of text [18], whereas joint models such as MoEL and CASE start from GloVe word vectors and train their encoders on ED alone [5], [7]; RoBERTa-GPT2, which is built on pre-trained RoBERTa and GPT-2, reaches a comparable 51.5% [32], showing that pre-training, not access to the full dialogue, drives the accuracy. Second, our detector is trained and selected only for emotion classification, whereas joint models share their capacity with response generation. As those models were not re-trained under our setting, we do not claim the best detector on ED.</w:t>
+        <w:t>For reference, our detector reads only the first user message yet exceeds the emotion accuracy reported by joint generation models that use the full dialogue context (30.6-48.3%) [2], [12], [33]. It achieves higher accuracy with less input for two reasons. First, it is initialised from RoBERTa, pre-trained on about 160 GB of text [20], whereas joint models such as MoEL and CASE start from GloVe word vectors and train their encoders on ED alone [5], [7]; RoBERTa-GPT2, which is built on pre-trained RoBERTa and GPT-2, reaches a comparable 51.5% [34], showing that pre-training, not access to the full dialogue, drives the accuracy. Second, our detector is trained and selected only for emotion classification, whereas joint models share their capacity with response generation. As those models were not re-trained under our setting, we do not claim the best detector on ED.</w:t>
       </w:r>
     </w:p>
     <w:p>
@@ -4261,7 +4291,7 @@
           <w:rFonts w:ascii="Times New Roman" w:hAnsi="Times New Roman"/>
           <w:sz w:val="20"/>
         </w:rPr>
-        <w:t xml:space="preserve"> ED is used under its CC BY-NC 4.0 licence, and no data from real users was collected; only ED text was sent to the judge APIs. The label set has no category for suicidal ideation and the system has no crisis safeguard, so it must not be deployed as a mental-health service without a reviewed crisis filter and referral mechanism [33].</w:t>
+        <w:t xml:space="preserve"> ED is used under its CC BY-NC 4.0 licence, and no data from real users was collected; only ED text was sent to the judge APIs. The label set has no category for suicidal ideation and the system has no crisis safeguard, so it must not be deployed as a mental-health service without a reviewed crisis filter and referral mechanism [35].</w:t>
       </w:r>
     </w:p>
     <w:p>
@@ -4627,7 +4657,7 @@
         </w:rPr>
         <w:t>[18]</w:t>
         <w:tab/>
-        <w:t>Y. Liu, M. Ott, N. Goyal, J. Du, M. Joshi, D. Chen, O. Levy, M. Lewis, L. Zettlemoyer, and V. Stoyanov, "RoBERTa: A robustly optimized BERT pretraining approach," arXiv:1907.11692, 2019.</w:t>
+        <w:t>A. Sharma, A. S. Miner, D. C. Atkins, and T. Althoff, "A computational approach to understanding empathy expressed in text-based mental health support," in Proc. 2020 Conf. Empirical Methods Natural Language Processing (EMNLP), 2020, pp. 5263-5276, doi: 10.18653/v1/2020.emnlp-main.425.</w:t>
       </w:r>
     </w:p>
     <w:p>
@@ -4643,7 +4673,7 @@
         </w:rPr>
         <w:t>[19]</w:t>
         <w:tab/>
-        <w:t>A. Abouelenin, A. Ashfaq, A. Atkinson et al. (Microsoft), "Phi-4-Mini technical report: Compact yet powerful multimodal language models via Mixture-of-LoRAs," arXiv:2503.01743, 2025.</w:t>
+        <w:t>Substance Abuse and Mental Health Services Administration, Enhancing Motivation for Change in Substance Use Disorder Treatment, Treatment Improvement Protocol (TIP) Series No. 35, SAMHSA Publication No. PEP19-02-01-003. Rockville, MD, USA: SAMHSA, 2019, ch. 3.</w:t>
       </w:r>
     </w:p>
     <w:p>
@@ -4659,7 +4689,7 @@
         </w:rPr>
         <w:t>[20]</w:t>
         <w:tab/>
-        <w:t>T. Dettmers, A. Pagnoni, A. Holtzman, and L. Zettlemoyer, "QLoRA: Efficient finetuning of quantized LLMs," in Advances in Neural Information Processing Systems (NeurIPS), vol. 36, 2023.</w:t>
+        <w:t>Y. Liu, M. Ott, N. Goyal, J. Du, M. Joshi, D. Chen, O. Levy, M. Lewis, L. Zettlemoyer, and V. Stoyanov, "RoBERTa: A robustly optimized BERT pretraining approach," arXiv:1907.11692, 2019.</w:t>
       </w:r>
     </w:p>
     <w:p>
@@ -4675,7 +4705,7 @@
         </w:rPr>
         <w:t>[21]</w:t>
         <w:tab/>
-        <w:t>A. Yang, B. Yang, B. Zhang, B. Hui et al. (Qwen Team), "Qwen2.5 technical report," arXiv:2412.15115, 2024.</w:t>
+        <w:t>A. Abouelenin, A. Ashfaq, A. Atkinson et al. (Microsoft), "Phi-4-Mini technical report: Compact yet powerful multimodal language models via Mixture-of-LoRAs," arXiv:2503.01743, 2025.</w:t>
       </w:r>
     </w:p>
     <w:p>
@@ -4691,7 +4721,7 @@
         </w:rPr>
         <w:t>[22]</w:t>
         <w:tab/>
-        <w:t>E. J. Hu, Y. Shen, P. Wallis, Z. Allen-Zhu, Y. Li, S. Wang, L. Wang, and W. Chen, "LoRA: Low-rank adaptation of large language models," in Proc. Int. Conf. Learning Representations (ICLR), 2022.</w:t>
+        <w:t>T. Dettmers, A. Pagnoni, A. Holtzman, and L. Zettlemoyer, "QLoRA: Efficient finetuning of quantized LLMs," in Advances in Neural Information Processing Systems (NeurIPS), vol. 36, 2023.</w:t>
       </w:r>
     </w:p>
     <w:p>
@@ -4707,7 +4737,7 @@
         </w:rPr>
         <w:t>[23]</w:t>
         <w:tab/>
-        <w:t>P. Lewis, E. Perez, A. Piktus, F. Petroni, V. Karpukhin, N. Goyal, H. Kuttler, M. Lewis, W. Yih, T. Rocktaschel, S. Riedel, and D. Kiela, "Retrieval-augmented generation for knowledge-intensive NLP tasks," in Advances in Neural Information Processing Systems (NeurIPS), vol. 33, 2020, pp. 9459-9474.</w:t>
+        <w:t>A. Yang, B. Yang, B. Zhang, B. Hui et al. (Qwen Team), "Qwen2.5 technical report," arXiv:2412.15115, 2024.</w:t>
       </w:r>
     </w:p>
     <w:p>
@@ -4723,7 +4753,7 @@
         </w:rPr>
         <w:t>[24]</w:t>
         <w:tab/>
-        <w:t>H. Yang, L. Huang, T. Li, N. Rusnachenko, and H. Liang, "hyy33 at WASSA 2024 empathy and personality shared task: Using the CombinedLoss and FGM for enhancing BERT-based models in emotion and empathy prediction from conversation turns," in Proc. 14th Workshop Computational Approaches to Subjectivity, Sentiment, &amp; Social Media Analysis (WASSA), 2024, pp. 430-434, doi: 10.18653/v1/2024.wassa-1.39.</w:t>
+        <w:t>E. J. Hu, Y. Shen, P. Wallis, Z. Allen-Zhu, Y. Li, S. Wang, L. Wang, and W. Chen, "LoRA: Low-rank adaptation of large language models," in Proc. Int. Conf. Learning Representations (ICLR), 2022.</w:t>
       </w:r>
     </w:p>
     <w:p>
@@ -4739,7 +4769,7 @@
         </w:rPr>
         <w:t>[25]</w:t>
         <w:tab/>
-        <w:t>Q. McNemar, "Note on the sampling error of the difference between correlated proportions or percentages," Psychometrika, vol. 12, no. 2, pp. 153-157, 1947.</w:t>
+        <w:t>P. Lewis, E. Perez, A. Piktus, F. Petroni, V. Karpukhin, N. Goyal, H. Kuttler, M. Lewis, W. Yih, T. Rocktaschel, S. Riedel, and D. Kiela, "Retrieval-augmented generation for knowledge-intensive NLP tasks," in Advances in Neural Information Processing Systems (NeurIPS), vol. 33, 2020, pp. 9459-9474.</w:t>
       </w:r>
     </w:p>
     <w:p>
@@ -4755,7 +4785,7 @@
         </w:rPr>
         <w:t>[26]</w:t>
         <w:tab/>
-        <w:t>F. Wilcoxon, "Individual comparisons by ranking methods," Biometrics Bulletin, vol. 1, no. 6, pp. 80-83, 1945.</w:t>
+        <w:t>H. Yang, L. Huang, T. Li, N. Rusnachenko, and H. Liang, "hyy33 at WASSA 2024 empathy and personality shared task: Using the CombinedLoss and FGM for enhancing BERT-based models in emotion and empathy prediction from conversation turns," in Proc. 14th Workshop Computational Approaches to Subjectivity, Sentiment, &amp; Social Media Analysis (WASSA), 2024, pp. 430-434, doi: 10.18653/v1/2024.wassa-1.39.</w:t>
       </w:r>
     </w:p>
     <w:p>
@@ -4771,7 +4801,7 @@
         </w:rPr>
         <w:t>[27]</w:t>
         <w:tab/>
-        <w:t>B. Efron and R. J. Tibshirani, An Introduction to the Bootstrap. New York, NY, USA: Chapman &amp; Hall, 1993.</w:t>
+        <w:t>Q. McNemar, "Note on the sampling error of the difference between correlated proportions or percentages," Psychometrika, vol. 12, no. 2, pp. 153-157, 1947.</w:t>
       </w:r>
     </w:p>
     <w:p>
@@ -4787,7 +4817,7 @@
         </w:rPr>
         <w:t>[28]</w:t>
         <w:tab/>
-        <w:t>S. Holm, "A simple sequentially rejective multiple test procedure," Scandinavian J. Statistics, vol. 6, no. 2, pp. 65-70, 1979.</w:t>
+        <w:t>F. Wilcoxon, "Individual comparisons by ranking methods," Biometrics Bulletin, vol. 1, no. 6, pp. 80-83, 1945.</w:t>
       </w:r>
     </w:p>
     <w:p>
@@ -4803,7 +4833,7 @@
         </w:rPr>
         <w:t>[29]</w:t>
         <w:tab/>
-        <w:t>A. Paszke, S. Gross, F. Massa, A. Lerer, J. Bradbury, G. Chanan et al., "PyTorch: An imperative style, high-performance deep learning library," in Advances in Neural Information Processing Systems (NeurIPS), vol. 32, 2019, pp. 8024-8035.</w:t>
+        <w:t>B. Efron and R. J. Tibshirani, An Introduction to the Bootstrap. New York, NY, USA: Chapman &amp; Hall, 1993.</w:t>
       </w:r>
     </w:p>
     <w:p>
@@ -4819,7 +4849,7 @@
         </w:rPr>
         <w:t>[30]</w:t>
         <w:tab/>
-        <w:t>T. Wolf, L. Debut, V. Sanh, J. Chaumond, C. Delangue, A. Moi, P. Cistac, T. Rault, R. Louf, M. Funtowicz et al., "Transformers: State-of-the-art natural language processing," in Proc. 2020 Conf. Empirical Methods Natural Language Processing: System Demonstrations, 2020, pp. 38-45, doi: 10.18653/v1/2020.emnlp-demos.6.</w:t>
+        <w:t>S. Holm, "A simple sequentially rejective multiple test procedure," Scandinavian J. Statistics, vol. 6, no. 2, pp. 65-70, 1979.</w:t>
       </w:r>
     </w:p>
     <w:p>
@@ -4835,7 +4865,7 @@
         </w:rPr>
         <w:t>[31]</w:t>
         <w:tab/>
-        <w:t>J. Wu, X. Huang, Z. Zhu, and S. Wang, "From traits to empathy: Personality-aware multimodal empathetic response generation," in Proc. 31st Int. Conf. Computational Linguistics (COLING), Abu Dhabi, UAE, 2025, pp. 8925-8938.</w:t>
+        <w:t>A. Paszke, S. Gross, F. Massa, A. Lerer, J. Bradbury, G. Chanan et al., "PyTorch: An imperative style, high-performance deep learning library," in Advances in Neural Information Processing Systems (NeurIPS), vol. 32, 2019, pp. 8024-8035.</w:t>
       </w:r>
     </w:p>
     <w:p>
@@ -4851,6 +4881,38 @@
         </w:rPr>
         <w:t>[32]</w:t>
         <w:tab/>
+        <w:t>T. Wolf, L. Debut, V. Sanh, J. Chaumond, C. Delangue, A. Moi, P. Cistac, T. Rault, R. Louf, M. Funtowicz et al., "Transformers: State-of-the-art natural language processing," in Proc. 2020 Conf. Empirical Methods Natural Language Processing: System Demonstrations, 2020, pp. 38-45, doi: 10.18653/v1/2020.emnlp-demos.6.</w:t>
+      </w:r>
+    </w:p>
+    <w:p>
+      <w:pPr>
+        <w:spacing w:before="0" w:after="0" w:line="240" w:lineRule="auto"/>
+        <w:ind w:left="432" w:hanging="432"/>
+        <w:jc w:val="both"/>
+      </w:pPr>
+      <w:r>
+        <w:rPr>
+          <w:rFonts w:ascii="Times New Roman" w:hAnsi="Times New Roman"/>
+          <w:sz w:val="16"/>
+        </w:rPr>
+        <w:t>[33]</w:t>
+        <w:tab/>
+        <w:t>J. Wu, X. Huang, Z. Zhu, and S. Wang, "From traits to empathy: Personality-aware multimodal empathetic response generation," in Proc. 31st Int. Conf. Computational Linguistics (COLING), Abu Dhabi, UAE, 2025, pp. 8925-8938.</w:t>
+      </w:r>
+    </w:p>
+    <w:p>
+      <w:pPr>
+        <w:spacing w:before="0" w:after="0" w:line="240" w:lineRule="auto"/>
+        <w:ind w:left="432" w:hanging="432"/>
+        <w:jc w:val="both"/>
+      </w:pPr>
+      <w:r>
+        <w:rPr>
+          <w:rFonts w:ascii="Times New Roman" w:hAnsi="Times New Roman"/>
+          <w:sz w:val="16"/>
+        </w:rPr>
+        <w:t>[34]</w:t>
+        <w:tab/>
         <w:t>Y. Liu, W. Maier, W. Minker, and S. Ultes, "Empathetic dialogue generation with pre-trained RoBERTa-GPT2 and external knowledge," in Proc. Int. Workshop Spoken Dialogue System Technology (IWSDS), 2021; arXiv:2109.03004.</w:t>
       </w:r>
     </w:p>
@@ -4865,7 +4927,7 @@
           <w:rFonts w:ascii="Times New Roman" w:hAnsi="Times New Roman"/>
           <w:sz w:val="16"/>
         </w:rPr>
-        <w:t>[33]</w:t>
+        <w:t>[35]</w:t>
         <w:tab/>
         <w:t>World Health Organization and International Association for Suicide Prevention, Preventing Suicide: A Resource for Media Professionals, Update 2023. Geneva, Switzerland: WHO, 2023. [Online]. Available: https://www.who.int/publications/i/item/9789240076846</w:t>
       </w:r>

</xml_diff>

<commit_message>
Paper: consistent n/a in Table I, match judge-panel check to thesis, submission-ready acknowledgment
Co-Authored-By: Claude Opus 5 (1M context) <noreply@anthropic.com>
</commit_message>
<xml_diff>
--- a/ICCIT format writing/paper.docx
+++ b/ICCIT format writing/paper.docx
@@ -262,7 +262,7 @@
           <w:rFonts w:ascii="Times New Roman" w:hAnsi="Times New Roman"/>
           <w:sz w:val="20"/>
         </w:rPr>
-        <w:t>A multi-signal evaluation (rule adherence, WASSA empathy, emotion validation and a blind LLM-judge panel) with paired significance tests and correction for multiple comparisons, including negative results for retrieval augmentation and fine-tuning.</w:t>
+        <w:t>A multi-signal evaluation (rule adherence, WASSA empathy, emotion validation and a blind LLM-judge panel) with paired significance tests and correction for multiple comparisons, including negative results for retrieval augmentation and for end-to-end fine-tuning.</w:t>
       </w:r>
     </w:p>
     <w:p>
@@ -937,7 +937,7 @@
           <w:rFonts w:ascii="Times New Roman" w:hAnsi="Times New Roman"/>
           <w:sz w:val="20"/>
         </w:rPr>
-        <w:t>: Nemotron 3 Ultra and gpt-oss-120b, from developers unrelated to our models [15], score each reply blind from 1 to 10 for empathy, relevance and safety at temperature 0; overall is the mean of the three. Judges are applied to a stratified subset of 64 conversations (the shortest and longest for each emotion). A third planned judge, Mistral Large, became unavailable before the final systems were judged; on the 320 replies it did score, the two- and three-judge averages correlate at Spearman ρ = 0.98 with identical system rankings.</w:t>
+        <w:t>: Nemotron 3 Ultra and gpt-oss-120b, from developers unrelated to our models [15], score each reply blind from 1 to 10 for empathy, relevance and safety at temperature 0; overall is the mean of the three. Judges are applied to a stratified subset of 64 conversations (the shortest and longest for each emotion). A third planned judge, Mistral Large, became unavailable before the final systems were judged; on the 256 replies it scored of systems still in the comparison, the two- and three-judge averages correlate at Spearman ρ = 0.97 with identical system rankings.</w:t>
       </w:r>
     </w:p>
     <w:p>
@@ -1049,7 +1049,7 @@
           <w:rFonts w:ascii="Times New Roman" w:hAnsi="Times New Roman"/>
           <w:sz w:val="16"/>
         </w:rPr>
-        <w:t>Results on 300 ED test conversations (judge scores on the 64-conversation subset). Params: total parameters in billions. Rules: replies satisfying all three rules. Val.: emotion validation. Emp./All: AI-judge empathy and overall (1-10); n/a = judging of this baseline was not complete at submission.</w:t>
+        <w:t>Results on 300 ED test conversations (judge scores on the 64-conversation subset). Params: total parameters in billions. Rules: replies satisfying all three rules. Val.: emotion validation. Emp./All: AI-judge empathy and overall (1-10); n/a = system not covered by the judge panel, or judging not complete at submission.</w:t>
       </w:r>
     </w:p>
     <w:tbl>
@@ -2334,7 +2334,7 @@
                 <w:rFonts w:ascii="Times New Roman" w:hAnsi="Times New Roman"/>
                 <w:sz w:val="16"/>
               </w:rPr>
-              <w:t>-</w:t>
+              <w:t>n/a</w:t>
             </w:r>
           </w:p>
         </w:tc>
@@ -2354,7 +2354,7 @@
                 <w:rFonts w:ascii="Times New Roman" w:hAnsi="Times New Roman"/>
                 <w:sz w:val="16"/>
               </w:rPr>
-              <w:t>-</w:t>
+              <w:t>n/a</w:t>
             </w:r>
           </w:p>
         </w:tc>
@@ -4346,16 +4346,8 @@
         <w:rPr>
           <w:rFonts w:ascii="Times New Roman" w:hAnsi="Times New Roman"/>
           <w:sz w:val="20"/>
-          <w:highlight w:val="yellow"/>
         </w:rPr>
-        <w:t>PENDING: funding or supervision acknowledgment, added after review.</w:t>
-      </w:r>
-      <w:r>
-        <w:rPr>
-          <w:rFonts w:ascii="Times New Roman" w:hAnsi="Times New Roman"/>
-          <w:sz w:val="20"/>
-        </w:rPr>
-        <w:t xml:space="preserve"> The authors used Claude (Anthropic) to assist with analysis scripts and with drafting and language editing of this manuscript. All experiments, results and text were reviewed, verified and revised by the authors, who take full responsibility for the content.</w:t>
+        <w:t>The authors used Claude (Anthropic) to assist with analysis scripts and with drafting and language editing of this manuscript. All experiments, results and text were reviewed, verified and revised by the authors, who take full responsibility for the content.</w:t>
       </w:r>
     </w:p>
     <w:p>

</xml_diff>

<commit_message>
Add single-model Phi baseline: empathy gains attributed to the decoupled design
New same-generator baseline (Phi-4-mini, no detector): rule adherence
73.7% but WASSA 4.75 and validation 27.0%, i.e. no better than the 1.5B
single model on empathy. Adding the detector and guidance to that same
generator gives 5.05 and 36.7% (both significant), so generator size does
not explain the empathy gains. Rule adherence is the trade-off (60.0% vs
73.7%). New thesis section 5.4.9; 5.2.1, 5.3.2, 5.6.1, README and the
conference paper updated.

Co-Authored-By: Claude Opus 5 (1M context) <noreply@anthropic.com>
</commit_message>
<xml_diff>
--- a/ICCIT format writing/paper.docx
+++ b/ICCIT format writing/paper.docx
@@ -62,7 +62,7 @@
           <w:b/>
           <w:sz w:val="18"/>
         </w:rPr>
-        <w:t>Small language models that run on local hardware are attractive for emotionally supportive conversation, because a user's disclosure never has to leave the device. It is unclear, however, whether such models benefit from a separate emotion detector or should simply be prompted to recognise the emotion and respond in one step. We present a controlled study on the EmpatheticDialogues benchmark in which every system uses the same 300 test conversations, the same decoding settings and a single 8 GB GPU. Our decoupled system passes the three most probable of 32 emotions from a RoBERTa-base detector (50.3% top-1 accuracy), together with emotion-specific guidance and attention-derived cue words, to a 4-bit Phi-4-mini generator. We evaluate replies with rule adherence, the WASSA 2024 empathy classifier, emotion validation and a blind two-judge LLM panel, using paired tests with Holm correction. The decoupled system (4.0B parameters) is significantly more empathetic and emotionally faithful than a 1.5B single model, but a 7.6B single model remains stronger on rule adherence and empathy; with 52% of its parameters and 38% less GPU memory, at a similar response time, our system reaches 97.5% of its overall AI-judge score. Three analyses show that detection accuracy is not the bottleneck: incorrect labels do not degrade replies, a more accurate detector brings no gain, and the generator's own emotion choice is less accurate than the detector's yet yields better replies. The benefit comes from how the detected emotion is used rather than how accurately it is detected.</w:t>
+        <w:t>Small language models that run on local hardware are attractive for emotionally supportive conversation, because a user's disclosure never has to leave the device. It is unclear, however, whether such models benefit from a separate emotion detector or should simply be prompted to recognise the emotion and respond in one step. We present a controlled study on the EmpatheticDialogues benchmark in which every system uses the same 300 test conversations, the same decoding settings and a single 8 GB GPU. Our decoupled system passes the three most probable of 32 emotions from a RoBERTa-base detector (50.3% top-1 accuracy), together with emotion-specific guidance and attention-derived cue words, to a 4-bit Phi-4-mini generator. We evaluate replies with rule adherence, the WASSA 2024 empathy classifier, emotion validation and a blind two-judge LLM panel, using paired tests with Holm correction. The decoupled system (4.0B parameters) is significantly more empathetic and emotionally faithful than single models of both 1.5B and, at an equal generator, 3.8B parameters, but a 7.6B single model remains stronger on rule adherence and empathy; with 52% of its parameters and 38% less GPU memory, at a similar response time, our system reaches 97.5% of its overall AI-judge score. Three analyses show that detection accuracy is not the bottleneck: incorrect labels do not degrade replies, a more accurate detector brings no gain, and the generator's own emotion choice is less accurate than the detector's yet yields better replies. The benefit comes from how the detected emotion is used rather than how accurately it is detected.</w:t>
       </w:r>
     </w:p>
     <w:p>
@@ -1074,7 +1074,7 @@
       <w:tr>
         <w:tc>
           <w:tcPr>
-            <w:tcW w:type="dxa" w:w="4340"/>
+            <w:tcW w:type="dxa" w:w="4477"/>
           </w:tcPr>
           <w:p>
             <w:pPr>
@@ -1095,7 +1095,7 @@
         </w:tc>
         <w:tc>
           <w:tcPr>
-            <w:tcW w:type="dxa" w:w="723"/>
+            <w:tcW w:type="dxa" w:w="707"/>
           </w:tcPr>
           <w:p>
             <w:pPr>
@@ -1116,7 +1116,7 @@
         </w:tc>
         <w:tc>
           <w:tcPr>
-            <w:tcW w:type="dxa" w:w="1085"/>
+            <w:tcW w:type="dxa" w:w="1060"/>
           </w:tcPr>
           <w:p>
             <w:pPr>
@@ -1137,7 +1137,7 @@
         </w:tc>
         <w:tc>
           <w:tcPr>
-            <w:tcW w:type="dxa" w:w="844"/>
+            <w:tcW w:type="dxa" w:w="825"/>
           </w:tcPr>
           <w:p>
             <w:pPr>
@@ -1158,7 +1158,7 @@
         </w:tc>
         <w:tc>
           <w:tcPr>
-            <w:tcW w:type="dxa" w:w="603"/>
+            <w:tcW w:type="dxa" w:w="589"/>
           </w:tcPr>
           <w:p>
             <w:pPr>
@@ -1179,7 +1179,7 @@
         </w:tc>
         <w:tc>
           <w:tcPr>
-            <w:tcW w:type="dxa" w:w="603"/>
+            <w:tcW w:type="dxa" w:w="589"/>
           </w:tcPr>
           <w:p>
             <w:pPr>
@@ -1200,7 +1200,7 @@
         </w:tc>
         <w:tc>
           <w:tcPr>
-            <w:tcW w:type="dxa" w:w="964"/>
+            <w:tcW w:type="dxa" w:w="943"/>
           </w:tcPr>
           <w:p>
             <w:pPr>
@@ -1221,7 +1221,7 @@
         </w:tc>
         <w:tc>
           <w:tcPr>
-            <w:tcW w:type="dxa" w:w="603"/>
+            <w:tcW w:type="dxa" w:w="589"/>
           </w:tcPr>
           <w:p>
             <w:pPr>
@@ -1242,7 +1242,7 @@
         </w:tc>
         <w:tc>
           <w:tcPr>
-            <w:tcW w:type="dxa" w:w="603"/>
+            <w:tcW w:type="dxa" w:w="589"/>
           </w:tcPr>
           <w:p>
             <w:pPr>
@@ -1265,7 +1265,7 @@
       <w:tr>
         <w:tc>
           <w:tcPr>
-            <w:tcW w:type="dxa" w:w="4340"/>
+            <w:tcW w:type="dxa" w:w="4477"/>
           </w:tcPr>
           <w:p>
             <w:pPr>
@@ -1285,7 +1285,7 @@
         </w:tc>
         <w:tc>
           <w:tcPr>
-            <w:tcW w:type="dxa" w:w="723"/>
+            <w:tcW w:type="dxa" w:w="707"/>
           </w:tcPr>
           <w:p>
             <w:pPr>
@@ -1305,7 +1305,7 @@
         </w:tc>
         <w:tc>
           <w:tcPr>
-            <w:tcW w:type="dxa" w:w="1085"/>
+            <w:tcW w:type="dxa" w:w="1060"/>
           </w:tcPr>
           <w:p>
             <w:pPr>
@@ -1325,7 +1325,7 @@
         </w:tc>
         <w:tc>
           <w:tcPr>
-            <w:tcW w:type="dxa" w:w="844"/>
+            <w:tcW w:type="dxa" w:w="825"/>
           </w:tcPr>
           <w:p>
             <w:pPr>
@@ -1345,7 +1345,7 @@
         </w:tc>
         <w:tc>
           <w:tcPr>
-            <w:tcW w:type="dxa" w:w="603"/>
+            <w:tcW w:type="dxa" w:w="589"/>
           </w:tcPr>
           <w:p>
             <w:pPr>
@@ -1365,7 +1365,7 @@
         </w:tc>
         <w:tc>
           <w:tcPr>
-            <w:tcW w:type="dxa" w:w="603"/>
+            <w:tcW w:type="dxa" w:w="589"/>
           </w:tcPr>
           <w:p>
             <w:pPr>
@@ -1385,7 +1385,7 @@
         </w:tc>
         <w:tc>
           <w:tcPr>
-            <w:tcW w:type="dxa" w:w="964"/>
+            <w:tcW w:type="dxa" w:w="943"/>
           </w:tcPr>
           <w:p>
             <w:pPr>
@@ -1405,7 +1405,7 @@
         </w:tc>
         <w:tc>
           <w:tcPr>
-            <w:tcW w:type="dxa" w:w="603"/>
+            <w:tcW w:type="dxa" w:w="589"/>
           </w:tcPr>
           <w:p>
             <w:pPr>
@@ -1425,7 +1425,7 @@
         </w:tc>
         <w:tc>
           <w:tcPr>
-            <w:tcW w:type="dxa" w:w="603"/>
+            <w:tcW w:type="dxa" w:w="589"/>
           </w:tcPr>
           <w:p>
             <w:pPr>
@@ -1447,7 +1447,7 @@
       <w:tr>
         <w:tc>
           <w:tcPr>
-            <w:tcW w:type="dxa" w:w="4340"/>
+            <w:tcW w:type="dxa" w:w="4477"/>
           </w:tcPr>
           <w:p>
             <w:pPr>
@@ -1467,7 +1467,7 @@
         </w:tc>
         <w:tc>
           <w:tcPr>
-            <w:tcW w:type="dxa" w:w="723"/>
+            <w:tcW w:type="dxa" w:w="707"/>
           </w:tcPr>
           <w:p>
             <w:pPr>
@@ -1487,7 +1487,7 @@
         </w:tc>
         <w:tc>
           <w:tcPr>
-            <w:tcW w:type="dxa" w:w="1085"/>
+            <w:tcW w:type="dxa" w:w="1060"/>
           </w:tcPr>
           <w:p>
             <w:pPr>
@@ -1507,7 +1507,7 @@
         </w:tc>
         <w:tc>
           <w:tcPr>
-            <w:tcW w:type="dxa" w:w="844"/>
+            <w:tcW w:type="dxa" w:w="825"/>
           </w:tcPr>
           <w:p>
             <w:pPr>
@@ -1527,7 +1527,7 @@
         </w:tc>
         <w:tc>
           <w:tcPr>
-            <w:tcW w:type="dxa" w:w="603"/>
+            <w:tcW w:type="dxa" w:w="589"/>
           </w:tcPr>
           <w:p>
             <w:pPr>
@@ -1547,7 +1547,7 @@
         </w:tc>
         <w:tc>
           <w:tcPr>
-            <w:tcW w:type="dxa" w:w="603"/>
+            <w:tcW w:type="dxa" w:w="589"/>
           </w:tcPr>
           <w:p>
             <w:pPr>
@@ -1567,7 +1567,7 @@
         </w:tc>
         <w:tc>
           <w:tcPr>
-            <w:tcW w:type="dxa" w:w="964"/>
+            <w:tcW w:type="dxa" w:w="943"/>
           </w:tcPr>
           <w:p>
             <w:pPr>
@@ -1587,7 +1587,7 @@
         </w:tc>
         <w:tc>
           <w:tcPr>
-            <w:tcW w:type="dxa" w:w="603"/>
+            <w:tcW w:type="dxa" w:w="589"/>
           </w:tcPr>
           <w:p>
             <w:pPr>
@@ -1607,7 +1607,7 @@
         </w:tc>
         <w:tc>
           <w:tcPr>
-            <w:tcW w:type="dxa" w:w="603"/>
+            <w:tcW w:type="dxa" w:w="589"/>
           </w:tcPr>
           <w:p>
             <w:pPr>
@@ -1629,7 +1629,7 @@
       <w:tr>
         <w:tc>
           <w:tcPr>
-            <w:tcW w:type="dxa" w:w="4340"/>
+            <w:tcW w:type="dxa" w:w="4477"/>
           </w:tcPr>
           <w:p>
             <w:pPr>
@@ -1649,7 +1649,7 @@
         </w:tc>
         <w:tc>
           <w:tcPr>
-            <w:tcW w:type="dxa" w:w="723"/>
+            <w:tcW w:type="dxa" w:w="707"/>
           </w:tcPr>
           <w:p>
             <w:pPr>
@@ -1669,7 +1669,7 @@
         </w:tc>
         <w:tc>
           <w:tcPr>
-            <w:tcW w:type="dxa" w:w="1085"/>
+            <w:tcW w:type="dxa" w:w="1060"/>
           </w:tcPr>
           <w:p>
             <w:pPr>
@@ -1689,7 +1689,7 @@
         </w:tc>
         <w:tc>
           <w:tcPr>
-            <w:tcW w:type="dxa" w:w="844"/>
+            <w:tcW w:type="dxa" w:w="825"/>
           </w:tcPr>
           <w:p>
             <w:pPr>
@@ -1709,7 +1709,7 @@
         </w:tc>
         <w:tc>
           <w:tcPr>
-            <w:tcW w:type="dxa" w:w="603"/>
+            <w:tcW w:type="dxa" w:w="589"/>
           </w:tcPr>
           <w:p>
             <w:pPr>
@@ -1729,7 +1729,7 @@
         </w:tc>
         <w:tc>
           <w:tcPr>
-            <w:tcW w:type="dxa" w:w="603"/>
+            <w:tcW w:type="dxa" w:w="589"/>
           </w:tcPr>
           <w:p>
             <w:pPr>
@@ -1749,7 +1749,7 @@
         </w:tc>
         <w:tc>
           <w:tcPr>
-            <w:tcW w:type="dxa" w:w="964"/>
+            <w:tcW w:type="dxa" w:w="943"/>
           </w:tcPr>
           <w:p>
             <w:pPr>
@@ -1769,7 +1769,7 @@
         </w:tc>
         <w:tc>
           <w:tcPr>
-            <w:tcW w:type="dxa" w:w="603"/>
+            <w:tcW w:type="dxa" w:w="589"/>
           </w:tcPr>
           <w:p>
             <w:pPr>
@@ -1789,7 +1789,7 @@
         </w:tc>
         <w:tc>
           <w:tcPr>
-            <w:tcW w:type="dxa" w:w="603"/>
+            <w:tcW w:type="dxa" w:w="589"/>
           </w:tcPr>
           <w:p>
             <w:pPr>
@@ -1811,7 +1811,189 @@
       <w:tr>
         <w:tc>
           <w:tcPr>
-            <w:tcW w:type="dxa" w:w="4340"/>
+            <w:tcW w:type="dxa" w:w="4477"/>
+          </w:tcPr>
+          <w:p>
+            <w:pPr>
+              <w:spacing w:before="0" w:after="0" w:line="240" w:lineRule="auto"/>
+              <w:ind w:firstLine="0"/>
+              <w:jc w:val="left"/>
+            </w:pPr>
+            <w:r/>
+            <w:r>
+              <w:rPr>
+                <w:rFonts w:ascii="Times New Roman" w:hAnsi="Times New Roman"/>
+                <w:sz w:val="16"/>
+              </w:rPr>
+              <w:t>Single model Phi-4-mini (our generator)</w:t>
+            </w:r>
+          </w:p>
+        </w:tc>
+        <w:tc>
+          <w:tcPr>
+            <w:tcW w:type="dxa" w:w="707"/>
+          </w:tcPr>
+          <w:p>
+            <w:pPr>
+              <w:spacing w:before="0" w:after="0" w:line="240" w:lineRule="auto"/>
+              <w:ind w:firstLine="0"/>
+              <w:jc w:val="center"/>
+            </w:pPr>
+            <w:r/>
+            <w:r>
+              <w:rPr>
+                <w:rFonts w:ascii="Times New Roman" w:hAnsi="Times New Roman"/>
+                <w:sz w:val="16"/>
+              </w:rPr>
+              <w:t>3.8</w:t>
+            </w:r>
+          </w:p>
+        </w:tc>
+        <w:tc>
+          <w:tcPr>
+            <w:tcW w:type="dxa" w:w="1060"/>
+          </w:tcPr>
+          <w:p>
+            <w:pPr>
+              <w:spacing w:before="0" w:after="0" w:line="240" w:lineRule="auto"/>
+              <w:ind w:firstLine="0"/>
+              <w:jc w:val="center"/>
+            </w:pPr>
+            <w:r/>
+            <w:r>
+              <w:rPr>
+                <w:rFonts w:ascii="Times New Roman" w:hAnsi="Times New Roman"/>
+                <w:sz w:val="16"/>
+              </w:rPr>
+              <w:t>73.7</w:t>
+            </w:r>
+          </w:p>
+        </w:tc>
+        <w:tc>
+          <w:tcPr>
+            <w:tcW w:type="dxa" w:w="825"/>
+          </w:tcPr>
+          <w:p>
+            <w:pPr>
+              <w:spacing w:before="0" w:after="0" w:line="240" w:lineRule="auto"/>
+              <w:ind w:firstLine="0"/>
+              <w:jc w:val="center"/>
+            </w:pPr>
+            <w:r/>
+            <w:r>
+              <w:rPr>
+                <w:rFonts w:ascii="Times New Roman" w:hAnsi="Times New Roman"/>
+                <w:sz w:val="16"/>
+              </w:rPr>
+              <w:t>96.0</w:t>
+            </w:r>
+          </w:p>
+        </w:tc>
+        <w:tc>
+          <w:tcPr>
+            <w:tcW w:type="dxa" w:w="589"/>
+          </w:tcPr>
+          <w:p>
+            <w:pPr>
+              <w:spacing w:before="0" w:after="0" w:line="240" w:lineRule="auto"/>
+              <w:ind w:firstLine="0"/>
+              <w:jc w:val="center"/>
+            </w:pPr>
+            <w:r/>
+            <w:r>
+              <w:rPr>
+                <w:rFonts w:ascii="Times New Roman" w:hAnsi="Times New Roman"/>
+                <w:sz w:val="16"/>
+              </w:rPr>
+              <w:t>73.5</w:t>
+            </w:r>
+          </w:p>
+        </w:tc>
+        <w:tc>
+          <w:tcPr>
+            <w:tcW w:type="dxa" w:w="589"/>
+          </w:tcPr>
+          <w:p>
+            <w:pPr>
+              <w:spacing w:before="0" w:after="0" w:line="240" w:lineRule="auto"/>
+              <w:ind w:firstLine="0"/>
+              <w:jc w:val="center"/>
+            </w:pPr>
+            <w:r/>
+            <w:r>
+              <w:rPr>
+                <w:rFonts w:ascii="Times New Roman" w:hAnsi="Times New Roman"/>
+                <w:sz w:val="16"/>
+              </w:rPr>
+              <w:t>4.75</w:t>
+            </w:r>
+          </w:p>
+        </w:tc>
+        <w:tc>
+          <w:tcPr>
+            <w:tcW w:type="dxa" w:w="943"/>
+          </w:tcPr>
+          <w:p>
+            <w:pPr>
+              <w:spacing w:before="0" w:after="0" w:line="240" w:lineRule="auto"/>
+              <w:ind w:firstLine="0"/>
+              <w:jc w:val="center"/>
+            </w:pPr>
+            <w:r/>
+            <w:r>
+              <w:rPr>
+                <w:rFonts w:ascii="Times New Roman" w:hAnsi="Times New Roman"/>
+                <w:sz w:val="16"/>
+              </w:rPr>
+              <w:t>27.0</w:t>
+            </w:r>
+          </w:p>
+        </w:tc>
+        <w:tc>
+          <w:tcPr>
+            <w:tcW w:type="dxa" w:w="589"/>
+          </w:tcPr>
+          <w:p>
+            <w:pPr>
+              <w:spacing w:before="0" w:after="0" w:line="240" w:lineRule="auto"/>
+              <w:ind w:firstLine="0"/>
+              <w:jc w:val="center"/>
+            </w:pPr>
+            <w:r/>
+            <w:r>
+              <w:rPr>
+                <w:rFonts w:ascii="Times New Roman" w:hAnsi="Times New Roman"/>
+                <w:sz w:val="16"/>
+              </w:rPr>
+              <w:t>n/a</w:t>
+            </w:r>
+          </w:p>
+        </w:tc>
+        <w:tc>
+          <w:tcPr>
+            <w:tcW w:type="dxa" w:w="589"/>
+          </w:tcPr>
+          <w:p>
+            <w:pPr>
+              <w:spacing w:before="0" w:after="0" w:line="240" w:lineRule="auto"/>
+              <w:ind w:firstLine="0"/>
+              <w:jc w:val="center"/>
+            </w:pPr>
+            <w:r/>
+            <w:r>
+              <w:rPr>
+                <w:rFonts w:ascii="Times New Roman" w:hAnsi="Times New Roman"/>
+                <w:sz w:val="16"/>
+              </w:rPr>
+              <w:t>n/a</w:t>
+            </w:r>
+          </w:p>
+        </w:tc>
+      </w:tr>
+      <w:tr>
+        <w:tc>
+          <w:tcPr>
+            <w:tcW w:type="dxa" w:w="4477"/>
           </w:tcPr>
           <w:p>
             <w:pPr>
@@ -1831,7 +2013,7 @@
         </w:tc>
         <w:tc>
           <w:tcPr>
-            <w:tcW w:type="dxa" w:w="723"/>
+            <w:tcW w:type="dxa" w:w="707"/>
           </w:tcPr>
           <w:p>
             <w:pPr>
@@ -1851,7 +2033,7 @@
         </w:tc>
         <w:tc>
           <w:tcPr>
-            <w:tcW w:type="dxa" w:w="1085"/>
+            <w:tcW w:type="dxa" w:w="1060"/>
           </w:tcPr>
           <w:p>
             <w:pPr>
@@ -1872,7 +2054,7 @@
         </w:tc>
         <w:tc>
           <w:tcPr>
-            <w:tcW w:type="dxa" w:w="844"/>
+            <w:tcW w:type="dxa" w:w="825"/>
           </w:tcPr>
           <w:p>
             <w:pPr>
@@ -1893,7 +2075,7 @@
         </w:tc>
         <w:tc>
           <w:tcPr>
-            <w:tcW w:type="dxa" w:w="603"/>
+            <w:tcW w:type="dxa" w:w="589"/>
           </w:tcPr>
           <w:p>
             <w:pPr>
@@ -1913,7 +2095,7 @@
         </w:tc>
         <w:tc>
           <w:tcPr>
-            <w:tcW w:type="dxa" w:w="603"/>
+            <w:tcW w:type="dxa" w:w="589"/>
           </w:tcPr>
           <w:p>
             <w:pPr>
@@ -1934,7 +2116,7 @@
         </w:tc>
         <w:tc>
           <w:tcPr>
-            <w:tcW w:type="dxa" w:w="964"/>
+            <w:tcW w:type="dxa" w:w="943"/>
           </w:tcPr>
           <w:p>
             <w:pPr>
@@ -1954,7 +2136,7 @@
         </w:tc>
         <w:tc>
           <w:tcPr>
-            <w:tcW w:type="dxa" w:w="603"/>
+            <w:tcW w:type="dxa" w:w="589"/>
           </w:tcPr>
           <w:p>
             <w:pPr>
@@ -1975,7 +2157,7 @@
         </w:tc>
         <w:tc>
           <w:tcPr>
-            <w:tcW w:type="dxa" w:w="603"/>
+            <w:tcW w:type="dxa" w:w="589"/>
           </w:tcPr>
           <w:p>
             <w:pPr>
@@ -1998,7 +2180,7 @@
       <w:tr>
         <w:tc>
           <w:tcPr>
-            <w:tcW w:type="dxa" w:w="4340"/>
+            <w:tcW w:type="dxa" w:w="4477"/>
           </w:tcPr>
           <w:p>
             <w:pPr>
@@ -2018,7 +2200,7 @@
         </w:tc>
         <w:tc>
           <w:tcPr>
-            <w:tcW w:type="dxa" w:w="723"/>
+            <w:tcW w:type="dxa" w:w="707"/>
           </w:tcPr>
           <w:p>
             <w:pPr>
@@ -2038,7 +2220,7 @@
         </w:tc>
         <w:tc>
           <w:tcPr>
-            <w:tcW w:type="dxa" w:w="1085"/>
+            <w:tcW w:type="dxa" w:w="1060"/>
           </w:tcPr>
           <w:p>
             <w:pPr>
@@ -2058,7 +2240,7 @@
         </w:tc>
         <w:tc>
           <w:tcPr>
-            <w:tcW w:type="dxa" w:w="844"/>
+            <w:tcW w:type="dxa" w:w="825"/>
           </w:tcPr>
           <w:p>
             <w:pPr>
@@ -2078,7 +2260,7 @@
         </w:tc>
         <w:tc>
           <w:tcPr>
-            <w:tcW w:type="dxa" w:w="603"/>
+            <w:tcW w:type="dxa" w:w="589"/>
           </w:tcPr>
           <w:p>
             <w:pPr>
@@ -2098,7 +2280,7 @@
         </w:tc>
         <w:tc>
           <w:tcPr>
-            <w:tcW w:type="dxa" w:w="603"/>
+            <w:tcW w:type="dxa" w:w="589"/>
           </w:tcPr>
           <w:p>
             <w:pPr>
@@ -2118,7 +2300,7 @@
         </w:tc>
         <w:tc>
           <w:tcPr>
-            <w:tcW w:type="dxa" w:w="964"/>
+            <w:tcW w:type="dxa" w:w="943"/>
           </w:tcPr>
           <w:p>
             <w:pPr>
@@ -2138,7 +2320,7 @@
         </w:tc>
         <w:tc>
           <w:tcPr>
-            <w:tcW w:type="dxa" w:w="603"/>
+            <w:tcW w:type="dxa" w:w="589"/>
           </w:tcPr>
           <w:p>
             <w:pPr>
@@ -2158,7 +2340,7 @@
         </w:tc>
         <w:tc>
           <w:tcPr>
-            <w:tcW w:type="dxa" w:w="603"/>
+            <w:tcW w:type="dxa" w:w="589"/>
           </w:tcPr>
           <w:p>
             <w:pPr>
@@ -2180,7 +2362,7 @@
       <w:tr>
         <w:tc>
           <w:tcPr>
-            <w:tcW w:type="dxa" w:w="4340"/>
+            <w:tcW w:type="dxa" w:w="4477"/>
           </w:tcPr>
           <w:p>
             <w:pPr>
@@ -2200,7 +2382,7 @@
         </w:tc>
         <w:tc>
           <w:tcPr>
-            <w:tcW w:type="dxa" w:w="723"/>
+            <w:tcW w:type="dxa" w:w="707"/>
           </w:tcPr>
           <w:p>
             <w:pPr>
@@ -2220,7 +2402,7 @@
         </w:tc>
         <w:tc>
           <w:tcPr>
-            <w:tcW w:type="dxa" w:w="1085"/>
+            <w:tcW w:type="dxa" w:w="1060"/>
           </w:tcPr>
           <w:p>
             <w:pPr>
@@ -2240,7 +2422,7 @@
         </w:tc>
         <w:tc>
           <w:tcPr>
-            <w:tcW w:type="dxa" w:w="844"/>
+            <w:tcW w:type="dxa" w:w="825"/>
           </w:tcPr>
           <w:p>
             <w:pPr>
@@ -2260,7 +2442,7 @@
         </w:tc>
         <w:tc>
           <w:tcPr>
-            <w:tcW w:type="dxa" w:w="603"/>
+            <w:tcW w:type="dxa" w:w="589"/>
           </w:tcPr>
           <w:p>
             <w:pPr>
@@ -2280,7 +2462,7 @@
         </w:tc>
         <w:tc>
           <w:tcPr>
-            <w:tcW w:type="dxa" w:w="603"/>
+            <w:tcW w:type="dxa" w:w="589"/>
           </w:tcPr>
           <w:p>
             <w:pPr>
@@ -2300,7 +2482,7 @@
         </w:tc>
         <w:tc>
           <w:tcPr>
-            <w:tcW w:type="dxa" w:w="964"/>
+            <w:tcW w:type="dxa" w:w="943"/>
           </w:tcPr>
           <w:p>
             <w:pPr>
@@ -2320,7 +2502,7 @@
         </w:tc>
         <w:tc>
           <w:tcPr>
-            <w:tcW w:type="dxa" w:w="603"/>
+            <w:tcW w:type="dxa" w:w="589"/>
           </w:tcPr>
           <w:p>
             <w:pPr>
@@ -2340,7 +2522,7 @@
         </w:tc>
         <w:tc>
           <w:tcPr>
-            <w:tcW w:type="dxa" w:w="603"/>
+            <w:tcW w:type="dxa" w:w="589"/>
           </w:tcPr>
           <w:p>
             <w:pPr>
@@ -2362,7 +2544,7 @@
       <w:tr>
         <w:tc>
           <w:tcPr>
-            <w:tcW w:type="dxa" w:w="4340"/>
+            <w:tcW w:type="dxa" w:w="4477"/>
           </w:tcPr>
           <w:p>
             <w:pPr>
@@ -2382,7 +2564,7 @@
         </w:tc>
         <w:tc>
           <w:tcPr>
-            <w:tcW w:type="dxa" w:w="723"/>
+            <w:tcW w:type="dxa" w:w="707"/>
           </w:tcPr>
           <w:p>
             <w:pPr>
@@ -2402,7 +2584,7 @@
         </w:tc>
         <w:tc>
           <w:tcPr>
-            <w:tcW w:type="dxa" w:w="1085"/>
+            <w:tcW w:type="dxa" w:w="1060"/>
           </w:tcPr>
           <w:p>
             <w:pPr>
@@ -2422,7 +2604,7 @@
         </w:tc>
         <w:tc>
           <w:tcPr>
-            <w:tcW w:type="dxa" w:w="844"/>
+            <w:tcW w:type="dxa" w:w="825"/>
           </w:tcPr>
           <w:p>
             <w:pPr>
@@ -2442,7 +2624,7 @@
         </w:tc>
         <w:tc>
           <w:tcPr>
-            <w:tcW w:type="dxa" w:w="603"/>
+            <w:tcW w:type="dxa" w:w="589"/>
           </w:tcPr>
           <w:p>
             <w:pPr>
@@ -2462,7 +2644,7 @@
         </w:tc>
         <w:tc>
           <w:tcPr>
-            <w:tcW w:type="dxa" w:w="603"/>
+            <w:tcW w:type="dxa" w:w="589"/>
           </w:tcPr>
           <w:p>
             <w:pPr>
@@ -2482,7 +2664,7 @@
         </w:tc>
         <w:tc>
           <w:tcPr>
-            <w:tcW w:type="dxa" w:w="964"/>
+            <w:tcW w:type="dxa" w:w="943"/>
           </w:tcPr>
           <w:p>
             <w:pPr>
@@ -2502,7 +2684,7 @@
         </w:tc>
         <w:tc>
           <w:tcPr>
-            <w:tcW w:type="dxa" w:w="603"/>
+            <w:tcW w:type="dxa" w:w="589"/>
           </w:tcPr>
           <w:p>
             <w:pPr>
@@ -2522,7 +2704,7 @@
         </w:tc>
         <w:tc>
           <w:tcPr>
-            <w:tcW w:type="dxa" w:w="603"/>
+            <w:tcW w:type="dxa" w:w="589"/>
           </w:tcPr>
           <w:p>
             <w:pPr>
@@ -2544,7 +2726,7 @@
       <w:tr>
         <w:tc>
           <w:tcPr>
-            <w:tcW w:type="dxa" w:w="4340"/>
+            <w:tcW w:type="dxa" w:w="4477"/>
           </w:tcPr>
           <w:p>
             <w:pPr>
@@ -2565,7 +2747,7 @@
         </w:tc>
         <w:tc>
           <w:tcPr>
-            <w:tcW w:type="dxa" w:w="723"/>
+            <w:tcW w:type="dxa" w:w="707"/>
           </w:tcPr>
           <w:p>
             <w:pPr>
@@ -2585,7 +2767,7 @@
         </w:tc>
         <w:tc>
           <w:tcPr>
-            <w:tcW w:type="dxa" w:w="1085"/>
+            <w:tcW w:type="dxa" w:w="1060"/>
           </w:tcPr>
           <w:p>
             <w:pPr>
@@ -2605,7 +2787,7 @@
         </w:tc>
         <w:tc>
           <w:tcPr>
-            <w:tcW w:type="dxa" w:w="844"/>
+            <w:tcW w:type="dxa" w:w="825"/>
           </w:tcPr>
           <w:p>
             <w:pPr>
@@ -2625,7 +2807,7 @@
         </w:tc>
         <w:tc>
           <w:tcPr>
-            <w:tcW w:type="dxa" w:w="603"/>
+            <w:tcW w:type="dxa" w:w="589"/>
           </w:tcPr>
           <w:p>
             <w:pPr>
@@ -2645,7 +2827,7 @@
         </w:tc>
         <w:tc>
           <w:tcPr>
-            <w:tcW w:type="dxa" w:w="603"/>
+            <w:tcW w:type="dxa" w:w="589"/>
           </w:tcPr>
           <w:p>
             <w:pPr>
@@ -2665,7 +2847,7 @@
         </w:tc>
         <w:tc>
           <w:tcPr>
-            <w:tcW w:type="dxa" w:w="964"/>
+            <w:tcW w:type="dxa" w:w="943"/>
           </w:tcPr>
           <w:p>
             <w:pPr>
@@ -2686,7 +2868,7 @@
         </w:tc>
         <w:tc>
           <w:tcPr>
-            <w:tcW w:type="dxa" w:w="603"/>
+            <w:tcW w:type="dxa" w:w="589"/>
           </w:tcPr>
           <w:p>
             <w:pPr>
@@ -2706,7 +2888,7 @@
         </w:tc>
         <w:tc>
           <w:tcPr>
-            <w:tcW w:type="dxa" w:w="603"/>
+            <w:tcW w:type="dxa" w:w="589"/>
           </w:tcPr>
           <w:p>
             <w:pPr>
@@ -3404,67 +3586,37 @@
           <w:rFonts w:ascii="Times New Roman" w:hAnsi="Times New Roman"/>
           <w:sz w:val="20"/>
         </w:rPr>
-        <w:t xml:space="preserve">Because our generator is larger than the 1.5B single model, Table I alone cannot attribute the gains to decoupling. Two controlled comparisons separate the effects. </w:t>
+        <w:t xml:space="preserve">Because our generator is larger than the 1.5B single model, Table I alone cannot attribute the gains to decoupling. We therefore prompt </w:t>
       </w:r>
       <w:r>
         <w:rPr>
           <w:rFonts w:ascii="Times New Roman" w:hAnsi="Times New Roman"/>
-          <w:i/>
+          <w:b/>
           <w:sz w:val="20"/>
         </w:rPr>
-        <w:t>Decoupling with the generator fixed</w:t>
+        <w:t>our own generator as a single model</w:t>
       </w:r>
       <w:r>
         <w:rPr>
           <w:rFonts w:ascii="Times New Roman" w:hAnsi="Times New Roman"/>
           <w:sz w:val="20"/>
         </w:rPr>
-        <w:t xml:space="preserve">: adding a detector to Qwen2.5-1.5B (initial pipeline against the 1.5B single model) raises rule adherence from 51.3% to 63.7% (McNemar p = 0.002), driven by the one-question rule (87.3% against 73.7%), but changes neither WASSA (4.80 against 4.84, p = 0.69), emotion validation (26.0% against 25.7%, p = 1.0) nor the judges' overall score (8.04 against 8.24, p = 0.14). </w:t>
+        <w:t xml:space="preserve">, with no detector. </w:t>
       </w:r>
       <w:r>
         <w:rPr>
           <w:rFonts w:ascii="Times New Roman" w:hAnsi="Times New Roman"/>
-          <w:i/>
+          <w:b/>
           <w:sz w:val="20"/>
         </w:rPr>
-        <w:t>Guidance with detector and generator fixed</w:t>
+        <w:t>Capacity explains the structural gains; the decoupled design explains the empathic gains.</w:t>
       </w:r>
       <w:r>
         <w:rPr>
           <w:rFonts w:ascii="Times New Roman" w:hAnsi="Times New Roman"/>
           <w:sz w:val="20"/>
         </w:rPr>
-        <w:t xml:space="preserve">: the two-stage prompt improves empathy and emotion fidelity over top-1 prompting (Table II). Decoupling therefore mainly improves </w:t>
-      </w:r>
-      <w:r>
-        <w:rPr>
-          <w:rFonts w:ascii="Times New Roman" w:hAnsi="Times New Roman"/>
-          <w:i/>
-          <w:sz w:val="20"/>
-        </w:rPr>
-        <w:t>structural control</w:t>
-      </w:r>
-      <w:r>
-        <w:rPr>
-          <w:rFonts w:ascii="Times New Roman" w:hAnsi="Times New Roman"/>
-          <w:sz w:val="20"/>
-        </w:rPr>
-        <w:t xml:space="preserve"> of the reply, whereas emotion-specific guidance improves its </w:t>
-      </w:r>
-      <w:r>
-        <w:rPr>
-          <w:rFonts w:ascii="Times New Roman" w:hAnsi="Times New Roman"/>
-          <w:i/>
-          <w:sz w:val="20"/>
-        </w:rPr>
-        <w:t>empathic content</w:t>
-      </w:r>
-      <w:r>
-        <w:rPr>
-          <w:rFonts w:ascii="Times New Roman" w:hAnsi="Times New Roman"/>
-          <w:sz w:val="20"/>
-        </w:rPr>
-        <w:t>. The two-stage design also depends on generator capacity: with Qwen2.5-1.5B it reduced rule adherence to 36.7%.</w:t>
+        <w:t xml:space="preserve"> Moving from Qwen2.5-1.5B to Phi-4-mini as a single model raises rule adherence from 51.3% to 73.7% (p &lt; 0.001) but leaves WASSA (4.84 to 4.75, p = 0.18) and emotion validation (25.7% to 27.0%, p = 0.70) unchanged: a larger generator alone buys none of the empathy we report. Adding the detector and emotion-specific guidance to that same generator raises WASSA to 5.05 (+0.30, adjusted p &lt; 0.001) and emotion validation to 36.7% (+9.7 points, adjusted p = 0.007). The design's cost is rule adherence, which falls to 60.0% (-13.7 points, p = 0.002), mainly through the keyword-based acknowledgement check (66.3% against 77.3%), because the rules share the prompt with emotion-specific guidance. At an equal generator the decoupled design therefore trades part of its rule adherence for significantly more empathetic and more emotionally faithful replies. The two-stage prompt also depends on generator capacity: with Qwen2.5-1.5B it reduced rule adherence to 36.7%.</w:t>
       </w:r>
     </w:p>
     <w:p>
@@ -4269,7 +4421,7 @@
           <w:rFonts w:ascii="Times New Roman" w:hAnsi="Times New Roman"/>
           <w:sz w:val="20"/>
         </w:rPr>
-        <w:t>This study has several limitations. We did not evaluate a single-model baseline built on Phi-4-mini, so the comparison with the 1.5B single model combines decoupling, guidance and generator capacity; Section V-C separates these only with the Qwen2.5-1.5B generator. Automatic measures are proxies: the acknowledgement check is keyword-based, WASSA rewards length (Spearman ρ = 0.14-0.54 with word count within systems) and was trained on discussions of news articles [17], emotion validation uses our own detector, and LLM judges prefer longer answers [14]. Judge results rest on 64 conversations. All measures reported here are automatic: a human preference study is under way but not complete, so the ranking rests on rule checks, an empathy classifier and LLM judges rather than on the judgement of people seeking support. Evaluation covers single turns in English, and resource use was measured on one GPU. Our system reuses stock phrases in 58.7% of replies.</w:t>
+        <w:t>This study has several limitations. The single-model Phi-4-mini baseline of Section V-C has not yet been scored by the AI judges, so its comparison rests on rule adherence, WASSA and emotion validation. Automatic measures are proxies: the acknowledgement check is keyword-based, WASSA rewards length (Spearman ρ = 0.14-0.54 with word count within systems) and was trained on discussions of news articles [17], emotion validation uses our own detector, and LLM judges prefer longer answers [14]. Judge results rest on 64 conversations. All measures reported here are automatic: a human preference study is under way but not complete, so the ranking rests on rule checks, an empathy classifier and LLM judges rather than on the judgement of people seeking support. Evaluation covers single turns in English, and resource use was measured on one GPU. Our system reuses stock phrases in 58.7% of replies.</w:t>
       </w:r>
     </w:p>
     <w:p>
@@ -4319,7 +4471,7 @@
           <w:rFonts w:ascii="Times New Roman" w:hAnsi="Times New Roman"/>
           <w:sz w:val="20"/>
         </w:rPr>
-        <w:t>We compared decoupled and monolithic small language models for empathetic response generation under identical data, decoding and hardware. A RoBERTa-base detector feeding its top-3 emotions and emotion-specific guidance to a 4-bit Phi-4-mini produces replies that are significantly more empathetic and emotionally faithful than a 1.5B single model, although a 7.6B single model remains stronger. Detection accuracy is not the limiting factor; how the detected emotion is used matters more. Future work should complete the human preference study, add a Phi-4-mini single-model baseline, combine emotion-specific guidance with larger generators, and evaluate multi-turn conversations with mental-health professionals.</w:t>
+        <w:t>We compared decoupled and monolithic small language models for empathetic response generation under identical data, decoding and hardware. A RoBERTa-base detector feeding its top-3 emotions and emotion-specific guidance to a 4-bit Phi-4-mini produces replies that are significantly more empathetic and emotionally faithful than the same generator used alone, at the cost of some rule adherence, although a 7.6B single model remains stronger overall. Detection accuracy is not the limiting factor; how the detected emotion is used matters more. Future work should complete the human preference study, add a Phi-4-mini single-model baseline, combine emotion-specific guidance with larger generators, and evaluate multi-turn conversations with mental-health professionals.</w:t>
       </w:r>
     </w:p>
     <w:p>

</xml_diff>

<commit_message>
Complete AI-judge panel: all 8 systems scored by both judges
Merged teammate Nemotron scores for the single-model Phi baseline. With
the full panel: fine-tuned 3.88/5.96, single Phi 8.04/8.78, ours 7.84/8.68,
7B 8.15/8.90. After Holm correction over seven comparisons the judges no
longer separate the four Phi-scale systems, including ours from the 7B and
from single Phi. Judge agreement rho 0.69/0.68 over 512 replies; WASSA vs
judge system ranking rho 0.74, disagreeing on the single Phi baseline.
Thesis 5.1.8, 5.3.6, 5.3.7, 5.4.9, 5.2.1, 5.6 and the paper updated; last
judge placeholders removed.

Co-Authored-By: Claude Opus 5 (1M context) <noreply@anthropic.com>
</commit_message>
<xml_diff>
--- a/ICCIT format writing/paper.docx
+++ b/ICCIT format writing/paper.docx
@@ -62,7 +62,7 @@
           <w:b/>
           <w:sz w:val="18"/>
         </w:rPr>
-        <w:t>Small language models that run on local hardware are attractive for emotionally supportive conversation, because a user's disclosure never has to leave the device. It is unclear, however, whether such models benefit from a separate emotion detector or should simply be prompted to recognise the emotion and respond in one step. We present a controlled study on the EmpatheticDialogues benchmark in which every system uses the same 300 test conversations, the same decoding settings and a single 8 GB GPU. Our decoupled system passes the three most probable of 32 emotions from a RoBERTa-base detector (50.3% top-1 accuracy), together with emotion-specific guidance and attention-derived cue words, to a 4-bit Phi-4-mini generator. We evaluate replies with rule adherence, the WASSA 2024 empathy classifier, emotion validation and a blind two-judge LLM panel, using paired tests with Holm correction. The decoupled system (4.0B parameters) is significantly more empathetic and emotionally faithful than single models of both 1.5B and, at an equal generator, 3.8B parameters, but a 7.6B single model remains stronger on rule adherence and empathy; with 52% of its parameters and 38% less GPU memory, at a similar response time, our system reaches 97.5% of its overall AI-judge score. Three analyses show that detection accuracy is not the bottleneck: incorrect labels do not degrade replies, a more accurate detector brings no gain, and the generator's own emotion choice is less accurate than the detector's yet yields better replies. The benefit comes from how the detected emotion is used rather than how accurately it is detected.</w:t>
+        <w:t>Small language models that run on local hardware are attractive for emotionally supportive conversation, because a user's disclosure never has to leave the device. It is unclear, however, whether such models benefit from a separate emotion detector or should simply be prompted to recognise the emotion and respond in one step. We present a controlled study on the EmpatheticDialogues benchmark in which every system uses the same 300 test conversations, the same decoding settings and a single 8 GB GPU. Our decoupled system passes the three most probable of 32 emotions from a RoBERTa-base detector (50.3% top-1 accuracy), together with emotion-specific guidance and attention-derived cue words, to a 4-bit Phi-4-mini generator. We evaluate replies with rule adherence, the WASSA 2024 empathy classifier, emotion validation and a blind two-judge LLM panel, using paired tests with Holm correction. The decoupled system (4.0B parameters) is significantly more empathetic and emotionally faithful than a 1.5B single model, and, at an equal generator, significantly more emotionally faithful and higher on the empathy classifier than that generator used alone, but a 7.6B single model remains stronger on rule adherence and empathy; with 52% of its parameters and 38% less GPU memory, at a similar response time, our system reaches 97.5% of its overall AI-judge score. Three analyses show that detection accuracy is not the bottleneck: incorrect labels do not degrade replies, a more accurate detector brings no gain, and the generator's own emotion choice is less accurate than the detector's yet yields better replies. The benefit comes from how the detected emotion is used rather than how accurately it is detected.</w:t>
       </w:r>
     </w:p>
     <w:p>
@@ -1601,7 +1601,7 @@
                 <w:rFonts w:ascii="Times New Roman" w:hAnsi="Times New Roman"/>
                 <w:sz w:val="16"/>
               </w:rPr>
-              <w:t>n/a</w:t>
+              <w:t>3.88</w:t>
             </w:r>
           </w:p>
         </w:tc>
@@ -1621,7 +1621,7 @@
                 <w:rFonts w:ascii="Times New Roman" w:hAnsi="Times New Roman"/>
                 <w:sz w:val="16"/>
               </w:rPr>
-              <w:t>n/a</w:t>
+              <w:t>5.96</w:t>
             </w:r>
           </w:p>
         </w:tc>
@@ -1965,7 +1965,7 @@
                 <w:rFonts w:ascii="Times New Roman" w:hAnsi="Times New Roman"/>
                 <w:sz w:val="16"/>
               </w:rPr>
-              <w:t>n/a</w:t>
+              <w:t>8.04</w:t>
             </w:r>
           </w:p>
         </w:tc>
@@ -1985,7 +1985,7 @@
                 <w:rFonts w:ascii="Times New Roman" w:hAnsi="Times New Roman"/>
                 <w:sz w:val="16"/>
               </w:rPr>
-              <w:t>n/a</w:t>
+              <w:t>8.78</w:t>
             </w:r>
           </w:p>
         </w:tc>
@@ -3542,7 +3542,7 @@
           <w:rFonts w:ascii="Times New Roman" w:hAnsi="Times New Roman"/>
           <w:sz w:val="20"/>
         </w:rPr>
-        <w:t xml:space="preserve">, it is significantly worse on rule adherence, WASSA and judge-rated empathy; the gap in the judges' overall score (-0.21) does not survive correction (corrected p = 0.073). </w:t>
+        <w:t xml:space="preserve">, it is significantly worse on rule adherence and WASSA, while the judges' empathy (-0.30) and overall (-0.21) gaps do not survive correction (p = 0.073 and p = 0.109). </w:t>
       </w:r>
       <w:r>
         <w:rPr>
@@ -3616,7 +3616,7 @@
           <w:rFonts w:ascii="Times New Roman" w:hAnsi="Times New Roman"/>
           <w:sz w:val="20"/>
         </w:rPr>
-        <w:t xml:space="preserve"> Moving from Qwen2.5-1.5B to Phi-4-mini as a single model raises rule adherence from 51.3% to 73.7% (p &lt; 0.001) but leaves WASSA (4.84 to 4.75, p = 0.18) and emotion validation (25.7% to 27.0%, p = 0.70) unchanged: a larger generator alone buys none of the empathy we report. Adding the detector and emotion-specific guidance to that same generator raises WASSA to 5.05 (+0.30, adjusted p &lt; 0.001) and emotion validation to 36.7% (+9.7 points, adjusted p = 0.007). The design's cost is rule adherence, which falls to 60.0% (-13.7 points, p = 0.002), mainly through the keyword-based acknowledgement check (66.3% against 77.3%), because the rules share the prompt with emotion-specific guidance. At an equal generator the decoupled design therefore trades part of its rule adherence for significantly more empathetic and more emotionally faithful replies. The two-stage prompt also depends on generator capacity: with Qwen2.5-1.5B it reduced rule adherence to 36.7%.</w:t>
+        <w:t xml:space="preserve"> Moving from Qwen2.5-1.5B to Phi-4-mini as a single model raises rule adherence from 51.3% to 73.7% (p &lt; 0.001) but leaves WASSA (4.84 to 4.75, p = 0.18) and emotion validation (25.7% to 27.0%, p = 0.70) unchanged: a larger generator alone buys none of the empathy we report. Adding the detector and emotion-specific guidance to that same generator raises WASSA to 5.05 (+0.30, adjusted p &lt; 0.001) and emotion validation to 36.7% (+9.7 points, adjusted p = 0.007). The design's cost is rule adherence, which falls to 60.0% (-13.7 points, p = 0.002), mainly through the keyword-based acknowledgement check (66.3% against 77.3%), because the rules share the prompt with emotion-specific guidance. The AI judges place the two level (empathy 7.84 against 8.04, p = 0.077; overall 8.68 against 8.78, p = 0.16), so at an equal generator the decoupled design gains on what the reply expresses and loses on its form. At an equal generator the decoupled design therefore trades part of its rule adherence for significantly more empathetic and more emotionally faithful replies. The two-stage prompt also depends on generator capacity: with Qwen2.5-1.5B it reduced rule adherence to 36.7%.</w:t>
       </w:r>
     </w:p>
     <w:p>
@@ -4313,7 +4313,7 @@
           <w:rFonts w:ascii="Times New Roman" w:hAnsi="Times New Roman"/>
           <w:sz w:val="20"/>
         </w:rPr>
-        <w:t>The judged systems exclude the fine-tuned baseline, whose judging was still in progress. The two judges agree with each other at Spearman ρ = 0.60 for empathy and overall across 384 replies of six systems, and rank them identically except for exchanging our system and top-1 Phi, whose scores differ by 0.03. At the system level, WASSA ranks the systems in nearly the same order as the judges (ρ = 0.94).</w:t>
+        <w:t>The two judges agree with each other at Spearman ρ = 0.69 for empathy and 0.68 overall across 512 replies of eight systems, and rank them identically except for exchanging our system and top-1 Phi, whose scores differ by 0.03. At the system level, WASSA ranks the systems broadly as the judges do (ρ = 0.74) but disagrees on the single-model Phi baseline, which is second by judge empathy and seventh by WASSA.</w:t>
       </w:r>
     </w:p>
     <w:p>
@@ -4421,7 +4421,7 @@
           <w:rFonts w:ascii="Times New Roman" w:hAnsi="Times New Roman"/>
           <w:sz w:val="20"/>
         </w:rPr>
-        <w:t>This study has several limitations. The single-model Phi-4-mini baseline of Section V-C has not yet been scored by the AI judges, so its comparison rests on rule adherence, WASSA and emotion validation. Automatic measures are proxies: the acknowledgement check is keyword-based, WASSA rewards length (Spearman ρ = 0.14-0.54 with word count within systems) and was trained on discussions of news articles [17], emotion validation uses our own detector, and LLM judges prefer longer answers [14]. Judge results rest on 64 conversations. All measures reported here are automatic: a human preference study is under way but not complete, so the ranking rests on rule checks, an empathy classifier and LLM judges rather than on the judgement of people seeking support. Evaluation covers single turns in English, and resource use was measured on one GPU. Our system reuses stock phrases in 58.7% of replies.</w:t>
+        <w:t>This study has several limitations. At an equal generator the measures disagree, so the case for the decoupled design rests on emotion validation and the empathy classifier rather than on the judges, which rate the two configurations equally. Automatic measures are proxies: the acknowledgement check is keyword-based, WASSA rewards length (Spearman ρ = 0.14-0.54 with word count within systems) and was trained on discussions of news articles [17], emotion validation uses our own detector, and LLM judges prefer longer answers [14]. Judge results rest on 64 conversations. All measures reported here are automatic: a human preference study is under way but not complete, so the ranking rests on rule checks, an empathy classifier and LLM judges rather than on the judgement of people seeking support. Evaluation covers single turns in English, and resource use was measured on one GPU. Our system reuses stock phrases in 58.7% of replies.</w:t>
       </w:r>
     </w:p>
     <w:p>
@@ -4471,7 +4471,7 @@
           <w:rFonts w:ascii="Times New Roman" w:hAnsi="Times New Roman"/>
           <w:sz w:val="20"/>
         </w:rPr>
-        <w:t>We compared decoupled and monolithic small language models for empathetic response generation under identical data, decoding and hardware. A RoBERTa-base detector feeding its top-3 emotions and emotion-specific guidance to a 4-bit Phi-4-mini produces replies that are significantly more empathetic and emotionally faithful than the same generator used alone, at the cost of some rule adherence, although a 7.6B single model remains stronger overall. Detection accuracy is not the limiting factor; how the detected emotion is used matters more. Future work should complete the human preference study, add a Phi-4-mini single-model baseline, combine emotion-specific guidance with larger generators, and evaluate multi-turn conversations with mental-health professionals.</w:t>
+        <w:t>We compared decoupled and monolithic small language models for empathetic response generation under identical data, decoding and hardware. A RoBERTa-base detector feeding its top-3 emotions and emotion-specific guidance to a 4-bit Phi-4-mini produces replies that are significantly more emotionally faithful and higher on the empathy classifier than the same generator used alone, at the cost of some rule adherence, while a 7.6B single model remains stronger on rule adherence and WASSA. Detection accuracy is not the limiting factor; how the detected emotion is used matters more. Future work should complete the human preference study, add a Phi-4-mini single-model baseline, combine emotion-specific guidance with larger generators, and evaluate multi-turn conversations with mental-health professionals.</w:t>
       </w:r>
     </w:p>
     <w:p>

</xml_diff>

<commit_message>
Paper: final consistency pass on abstract, Table I caption and results sentence
Co-Authored-By: Claude Opus 5 (1M context) <noreply@anthropic.com>
</commit_message>
<xml_diff>
--- a/ICCIT format writing/paper.docx
+++ b/ICCIT format writing/paper.docx
@@ -62,7 +62,7 @@
           <w:b/>
           <w:sz w:val="18"/>
         </w:rPr>
-        <w:t>Small language models that run on local hardware are attractive for emotionally supportive conversation, because a user's disclosure never has to leave the device. It is unclear, however, whether such models benefit from a separate emotion detector or should simply be prompted to recognise the emotion and respond in one step. We present a controlled study on the EmpatheticDialogues benchmark in which every system uses the same 300 test conversations, the same decoding settings and a single 8 GB GPU. Our decoupled system passes the three most probable of 32 emotions from a RoBERTa-base detector (50.3% top-1 accuracy), together with emotion-specific guidance and attention-derived cue words, to a 4-bit Phi-4-mini generator. We evaluate replies with rule adherence, the WASSA 2024 empathy classifier, emotion validation and a blind two-judge LLM panel, using paired tests with Holm correction. The decoupled system (4.0B parameters) is significantly more empathetic and emotionally faithful than a 1.5B single model, and, at an equal generator, significantly more emotionally faithful and higher on the empathy classifier than that generator used alone, but a 7.6B single model remains stronger on rule adherence and empathy; with 52% of its parameters and 38% less GPU memory, at a similar response time, our system reaches 97.5% of its overall AI-judge score. Three analyses show that detection accuracy is not the bottleneck: incorrect labels do not degrade replies, a more accurate detector brings no gain, and the generator's own emotion choice is less accurate than the detector's yet yields better replies. The benefit comes from how the detected emotion is used rather than how accurately it is detected.</w:t>
+        <w:t>Small language models that run on local hardware are attractive for emotionally supportive conversation, because a user's disclosure never has to leave the device. It is unclear, however, whether such models benefit from a separate emotion detector or should simply be prompted to recognise the emotion and respond in one step. We present a controlled study on the EmpatheticDialogues benchmark in which every system uses the same 300 test conversations, the same decoding settings and a single 8 GB GPU. Our decoupled system passes the three most probable of 32 emotions from a RoBERTa-base detector (50.3% top-1 accuracy), together with emotion-specific guidance and attention-derived cue words, to a 4-bit Phi-4-mini generator. We evaluate replies with rule adherence, the WASSA 2024 empathy classifier, emotion validation and a blind two-judge LLM panel, using paired tests with Holm correction. The decoupled system (4.0B parameters) is significantly more empathetic and emotionally faithful than a 1.5B single model, and, at an equal generator, significantly more emotionally faithful and higher on the empathy classifier than that generator used alone, but a 7.6B single model remains stronger on rule adherence and on the empathy classifier; with 52% of its parameters and 38% less GPU memory, at a similar response time, our system reaches 97.5% of its overall AI-judge score. Three analyses show that detection accuracy is not the bottleneck: incorrect labels do not degrade replies, a more accurate detector brings no gain, and the generator's own emotion choice is less accurate than the detector's yet yields better replies. The benefit comes from how the detected emotion is used rather than how accurately it is detected.</w:t>
       </w:r>
     </w:p>
     <w:p>
@@ -1049,7 +1049,7 @@
           <w:rFonts w:ascii="Times New Roman" w:hAnsi="Times New Roman"/>
           <w:sz w:val="16"/>
         </w:rPr>
-        <w:t>Results on 300 ED test conversations (judge scores on the 64-conversation subset). Params: total parameters in billions. Rules: replies satisfying all three rules. Val.: emotion validation. Emp./All: AI-judge empathy and overall (1-10); n/a = system not covered by the judge panel, or judging not complete at submission.</w:t>
+        <w:t>Results on 300 ED test conversations (judge scores on the 64-conversation subset). Params: total parameters in billions. Rules: replies satisfying all three rules. Val.: emotion validation. Emp./All: AI-judge empathy and overall (1-10); n/a = system not covered by the judge panel.</w:t>
       </w:r>
     </w:p>
     <w:tbl>
@@ -2937,7 +2937,7 @@
           <w:rFonts w:ascii="Times New Roman" w:hAnsi="Times New Roman"/>
           <w:sz w:val="20"/>
         </w:rPr>
-        <w:t>Table I summarises all systems. Our system achieves the highest emotion validation (36.7%) and the second-highest WASSA and AI-judge scores, behind only the 7.6B single model. The fine-tuned model learns the style of ED listeners: 10-word replies that usually ask a question but rarely acknowledge the feeling (30.0%), meeting all rules in 22.3% of cases. Retrieval augmentation lowered the initial pipeline's rule adherence from 63.7% to 43.7%, as the retrieved listener replies model the same style.</w:t>
+        <w:t>Table I summarises all systems. Our system achieves the highest emotion validation (36.7%) of any system and the second-highest WASSA score, behind only the 7.6B single model; on the AI judges it lies third, within 0.22 points of the highest-scoring system. The fine-tuned model learns the style of ED listeners: 10-word replies that usually ask a question but rarely acknowledge the feeling (30.0%), meeting all rules in 22.3% of cases. Retrieval augmentation lowered the initial pipeline's rule adherence from 63.7% to 43.7%, as the retrieved listener replies model the same style.</w:t>
       </w:r>
     </w:p>
     <w:p>

</xml_diff>

<commit_message>
Apply review fixes: A4, corrected asterisk, 1.9x parameters, consistent numbers
- documentclass now conference,a4paper (ICCIT template); docx preview A4 too
- Table II: judge-empathy gap vs 7.6B loses its asterisk (Holm p = 0.073 over
  seven judged baselines); caption states both correction families
- Discussion now says the 96.2% judge-empathy difference is not significant
- 7.6B vs our 4.0B is 1.9x, not 4.7x (paper, thesis 5.2.6, README, builder)
- Phi-4-mini single-model baseline removed from future work (it was run)
- RoBERTa-large reported consistently: 53.0% vs 50.1% on the test partition,
  53.3% vs 50.3% on the 300 evaluation conversations
- Abstract hedged: no significant degradation / no significant gain
- Figure 1: 'chosen' label no longer touches the boxes

Co-Authored-By: Claude Opus 5 (1M context) <noreply@anthropic.com>
</commit_message>
<xml_diff>
--- a/ICCIT format writing/paper.docx
+++ b/ICCIT format writing/paper.docx
@@ -34,7 +34,7 @@
     <w:p>
       <w:pPr>
         <w:sectPr>
-          <w:pgSz w:w="12240" w:h="15840"/>
+          <w:pgSz w:w="11909" w:h="16834"/>
           <w:pgMar w:top="1080" w:right="900" w:bottom="1440" w:left="900" w:header="720" w:footer="720" w:gutter="0"/>
           <w:cols w:space="720"/>
           <w:docGrid w:linePitch="360"/>
@@ -62,7 +62,7 @@
           <w:b/>
           <w:sz w:val="18"/>
         </w:rPr>
-        <w:t>Small language models that run on local hardware are attractive for emotionally supportive conversation, because a user's disclosure never has to leave the device. It is unclear, however, whether such models benefit from a separate emotion detector or should simply be prompted to recognise the emotion and respond in one step. We present a controlled study on the EmpatheticDialogues benchmark in which every system uses the same 300 test conversations, the same decoding settings and a single 8 GB GPU. Our decoupled system passes the three most probable of 32 emotions from a RoBERTa-base detector (50.3% top-1 accuracy), together with emotion-specific guidance and attention-derived cue words, to a 4-bit Phi-4-mini generator. We evaluate replies with rule adherence, the WASSA 2024 empathy classifier, emotion validation and a blind two-judge LLM panel, using paired tests with Holm correction. The decoupled system (4.0B parameters) is significantly more empathetic and emotionally faithful than a 1.5B single model, and, at an equal generator, significantly more emotionally faithful and higher on the empathy classifier than that generator used alone, but a 7.6B single model remains stronger on rule adherence and on the empathy classifier; with 52% of its parameters and 38% less GPU memory, at a similar response time, our system reaches 97.5% of its overall AI-judge score. Three analyses show that detection accuracy is not the bottleneck: incorrect labels do not degrade replies, a more accurate detector brings no gain, and the generator's own emotion choice is less accurate than the detector's yet yields better replies. The benefit comes from how the detected emotion is used rather than how accurately it is detected.</w:t>
+        <w:t>Small language models that run on local hardware are attractive for emotionally supportive conversation, because a user's disclosure never has to leave the device. It is unclear, however, whether such models benefit from a separate emotion detector or should simply be prompted to recognise the emotion and respond in one step. We present a controlled study on the EmpatheticDialogues benchmark in which every system uses the same 300 test conversations, the same decoding settings and a single 8 GB GPU. Our decoupled system passes the three most probable of 32 emotions from a RoBERTa-base detector (50.3% top-1 accuracy), together with emotion-specific guidance and attention-derived cue words, to a 4-bit Phi-4-mini generator. We evaluate replies with rule adherence, the WASSA 2024 empathy classifier, emotion validation and a blind two-judge LLM panel, using paired tests with Holm correction. The decoupled system (4.0B parameters) is significantly more empathetic and emotionally faithful than a 1.5B single model, and, at an equal generator, significantly more emotionally faithful and higher on the empathy classifier than that generator used alone, but a 7.6B single model remains stronger on rule adherence and on the empathy classifier; with 52% of its parameters and 38% less GPU memory, at a similar response time, our system reaches 97.5% of its overall AI-judge score. Three analyses show that detection accuracy is not the bottleneck: incorrect labels cause no significant degradation, a more accurate detector brings no significant gain, and the generator's own emotion choice is less accurate than the detector's yet yields better replies. The benefit comes from how the detected emotion is used rather than how accurately it is detected.</w:t>
       </w:r>
     </w:p>
     <w:p>
@@ -496,7 +496,7 @@
           <w:rFonts w:ascii="Times New Roman" w:hAnsi="Times New Roman"/>
           <w:sz w:val="20"/>
         </w:rPr>
-        <w:t xml:space="preserve">We fine-tune RoBERTa-base [20] (125M parameters) as a 32-way classifier on first utterances (learning rate 2e-5, effective batch size 16, linear warm-up over 6% of steps, early stopping on validation accuracy, at most 128 tokens). Among equally tuned base-size encoders, RoBERTa-base was comparable to ELECTRA in top-1 accuracy (50.1% against 50.2%), above BERT (48.8%), and gave the highest top-5 accuracy (85.0%); RoBERTa-large reached 53.0% but required 7x the training time. The deployed checkpoint reaches </w:t>
+        <w:t xml:space="preserve">We fine-tune RoBERTa-base [20] (125M parameters) as a 32-way classifier on first utterances (learning rate 2e-5, effective batch size 16, linear warm-up over 6% of steps, early stopping on validation accuracy, at most 128 tokens). Among equally tuned base-size encoders, RoBERTa-base was comparable to ELECTRA in top-1 accuracy (50.1% against 50.2%), above BERT (48.8%), and gave the highest top-5 accuracy (85.0%); RoBERTa-large reached 53.0%, 2.9 points higher, but required 7x the training time. The deployed checkpoint reaches </w:t>
       </w:r>
       <w:r>
         <w:rPr>
@@ -1017,7 +1017,7 @@
       <w:pPr>
         <w:sectPr>
           <w:type w:val="continuous"/>
-          <w:pgSz w:w="12240" w:h="15840"/>
+          <w:pgSz w:w="11909" w:h="16834"/>
           <w:pgMar w:top="1080" w:right="900" w:bottom="1440" w:left="900" w:header="720" w:footer="720" w:gutter="0"/>
           <w:docGrid w:linePitch="360"/>
           <w:cols w:num="2" w:space="360"/>
@@ -1061,15 +1061,15 @@
         <w:tblLook w:firstColumn="1" w:firstRow="1" w:lastColumn="0" w:lastRow="0" w:noHBand="0" w:noVBand="1" w:val="04A0"/>
       </w:tblPr>
       <w:tblGrid>
-        <w:gridCol w:w="1160"/>
-        <w:gridCol w:w="1160"/>
-        <w:gridCol w:w="1160"/>
-        <w:gridCol w:w="1160"/>
-        <w:gridCol w:w="1160"/>
-        <w:gridCol w:w="1160"/>
-        <w:gridCol w:w="1160"/>
-        <w:gridCol w:w="1160"/>
-        <w:gridCol w:w="1160"/>
+        <w:gridCol w:w="1123"/>
+        <w:gridCol w:w="1123"/>
+        <w:gridCol w:w="1123"/>
+        <w:gridCol w:w="1123"/>
+        <w:gridCol w:w="1123"/>
+        <w:gridCol w:w="1123"/>
+        <w:gridCol w:w="1123"/>
+        <w:gridCol w:w="1123"/>
+        <w:gridCol w:w="1123"/>
       </w:tblGrid>
       <w:tr>
         <w:tc>
@@ -2919,7 +2919,7 @@
       <w:pPr>
         <w:sectPr>
           <w:type w:val="continuous"/>
-          <w:pgSz w:w="12240" w:h="15840"/>
+          <w:pgSz w:w="11909" w:h="16834"/>
           <w:pgMar w:top="1080" w:right="900" w:bottom="1440" w:left="900" w:header="720" w:footer="720" w:gutter="0"/>
           <w:docGrid w:linePitch="360"/>
           <w:cols w:num="1" w:space="360"/>
@@ -2937,7 +2937,7 @@
           <w:rFonts w:ascii="Times New Roman" w:hAnsi="Times New Roman"/>
           <w:sz w:val="20"/>
         </w:rPr>
-        <w:t>Table I summarises all systems. Our system achieves the highest emotion validation (36.7%) of any system and the second-highest WASSA score, behind only the 7.6B single model; on the AI judges it lies third, within 0.22 points of the highest-scoring system. The fine-tuned model learns the style of ED listeners: 10-word replies that usually ask a question but rarely acknowledge the feeling (30.0%), meeting all rules in 22.3% of cases. Retrieval augmentation lowered the initial pipeline's rule adherence from 63.7% to 43.7%, as the retrieved listener replies model the same style. Because the measures disagree, we also summarise them by standardising five of them (rule adherence, WASSA, emotion validation, judge empathy and freedom from boilerplate) across systems and averaging them with equal weight: our system ranks second of eight, behind only the 7.6B single model, which needs 4.7 times the parameters and 62% more GPU memory, and first among the systems that fit the 8 GB budget. Removing any one measure leaves it second or third, so the ranking does not depend on a single favourable measure.</w:t>
+        <w:t>Table I summarises all systems. Our system achieves the highest emotion validation (36.7%) of any system and the second-highest WASSA score, behind only the 7.6B single model; on the AI judges it lies third, within 0.22 points of the highest-scoring system. The fine-tuned model learns the style of ED listeners: 10-word replies that usually ask a question but rarely acknowledge the feeling (30.0%), meeting all rules in 22.3% of cases. Retrieval augmentation lowered the initial pipeline's rule adherence from 63.7% to 43.7%, as the retrieved listener replies model the same style. Because the measures disagree, we also summarise them by standardising five of them (rule adherence, WASSA, emotion validation, judge empathy and freedom from boilerplate) across systems and averaging them with equal weight: our system ranks second of eight, behind only the 7.6B single model, which needs 1.9 times the parameters and 62% more GPU memory, and first among the systems that fit the 8 GB budget. Removing any one measure leaves it second or third, so the ranking does not depend on a single favourable measure.</w:t>
       </w:r>
     </w:p>
     <w:p>
@@ -2980,7 +2980,7 @@
           <w:rFonts w:ascii="Times New Roman" w:hAnsi="Times New Roman"/>
           <w:sz w:val="16"/>
         </w:rPr>
-        <w:t>Paired differences (ours minus baseline) with 95% bootstrap CIs. Rules and validation in percentage points. * significant after Holm correction.</w:t>
+        <w:t>Paired differences (ours minus baseline) with 95% bootstrap CIs. Rules and validation in percentage points. * significant after Holm correction, applied across the eight baselines for the first three rows and the seven judged baselines for the last two.</w:t>
       </w:r>
     </w:p>
     <w:tbl>
@@ -2992,10 +2992,10 @@
         <w:tblLook w:firstColumn="1" w:firstRow="1" w:lastColumn="0" w:lastRow="0" w:noHBand="0" w:noVBand="1" w:val="04A0"/>
       </w:tblPr>
       <w:tblGrid>
-        <w:gridCol w:w="2610"/>
-        <w:gridCol w:w="2610"/>
-        <w:gridCol w:w="2610"/>
-        <w:gridCol w:w="2610"/>
+        <w:gridCol w:w="2527"/>
+        <w:gridCol w:w="2527"/>
+        <w:gridCol w:w="2527"/>
+        <w:gridCol w:w="2527"/>
       </w:tblGrid>
       <w:tr>
         <w:tc>
@@ -3386,7 +3386,7 @@
                 <w:rFonts w:ascii="Times New Roman" w:hAnsi="Times New Roman"/>
                 <w:sz w:val="14"/>
               </w:rPr>
-              <w:t>-0.30 [-0.55, -0.07]*</w:t>
+              <w:t>-0.30 [-0.55, -0.07]</w:t>
             </w:r>
           </w:p>
         </w:tc>
@@ -3671,9 +3671,9 @@
         <w:tblLook w:firstColumn="1" w:firstRow="1" w:lastColumn="0" w:lastRow="0" w:noHBand="0" w:noVBand="1" w:val="04A0"/>
       </w:tblPr>
       <w:tblGrid>
-        <w:gridCol w:w="3480"/>
-        <w:gridCol w:w="3480"/>
-        <w:gridCol w:w="3480"/>
+        <w:gridCol w:w="3370"/>
+        <w:gridCol w:w="3370"/>
+        <w:gridCol w:w="3370"/>
       </w:tblGrid>
       <w:tr>
         <w:tc>
@@ -3943,7 +3943,7 @@
                 <w:rFonts w:ascii="Times New Roman" w:hAnsi="Times New Roman"/>
                 <w:sz w:val="14"/>
               </w:rPr>
-              <w:t>RoBERTa-base to -large in ours: accuracy</w:t>
+              <w:t>Detector accuracy, base to large, on these 300 conversations</w:t>
             </w:r>
           </w:p>
         </w:tc>
@@ -4363,7 +4363,7 @@
           <w:rFonts w:ascii="Times New Roman" w:hAnsi="Times New Roman"/>
           <w:sz w:val="20"/>
         </w:rPr>
-        <w:t xml:space="preserve"> With 52% of the parameters of the 7.6B single model, our system reaches 97.5% of its overall AI-judge score (difference not significant) and 96.2% of its judge-rated empathy (difference significant). At the detector level, RoBERTa-large has 2.8x the parameters of RoBERTa-base and 2.9 points higher test accuracy (Section III-B) but brings no gain in reply quality (Table III), so the smaller detector is the efficient choice.</w:t>
+        <w:t xml:space="preserve"> With 52% of the parameters of the 7.6B single model, our system reaches 97.5% of its overall AI-judge score (difference not significant) and 96.2% of its judge-rated empathy (neither difference is significant after correction). At the detector level, RoBERTa-large has 2.8x the parameters of RoBERTa-base and 2.9 points higher accuracy on the test partition (53.0% against 50.1%, Section III-B; 53.3% against 50.3% on the 300 evaluation conversations) but brings no significant gain in reply quality (Table III), so the smaller detector is the efficient choice.</w:t>
       </w:r>
     </w:p>
     <w:p>
@@ -4471,7 +4471,7 @@
           <w:rFonts w:ascii="Times New Roman" w:hAnsi="Times New Roman"/>
           <w:sz w:val="20"/>
         </w:rPr>
-        <w:t>We compared decoupled and monolithic small language models for empathetic response generation under identical data, decoding and hardware. A RoBERTa-base detector feeding its top-3 emotions and emotion-specific guidance to a 4-bit Phi-4-mini produces replies that are significantly more emotionally faithful and higher on the empathy classifier than the same generator used alone, at the cost of some rule adherence, while a 7.6B single model remains stronger on rule adherence and WASSA. Detection accuracy is not the limiting factor; how the detected emotion is used matters more. Future work should complete the human preference study, add a Phi-4-mini single-model baseline, combine emotion-specific guidance with larger generators, and evaluate multi-turn conversations with mental-health professionals.</w:t>
+        <w:t>We compared decoupled and monolithic small language models for empathetic response generation under identical data, decoding and hardware. A RoBERTa-base detector feeding its top-3 emotions and emotion-specific guidance to a 4-bit Phi-4-mini produces replies that are significantly more emotionally faithful and higher on the empathy classifier than the same generator used alone, at the cost of some rule adherence, while a 7.6B single model remains stronger on rule adherence and WASSA. Detection accuracy is not the limiting factor; how the detected emotion is used matters more. Future work should complete the human preference study, combine emotion-specific guidance with larger generators, and evaluate multi-turn conversations with mental-health professionals.</w:t>
       </w:r>
     </w:p>
     <w:p>
@@ -5078,7 +5078,7 @@
     </w:p>
     <w:sectPr>
       <w:type w:val="continuous"/>
-      <w:pgSz w:w="12240" w:h="15840"/>
+      <w:pgSz w:w="11909" w:h="16834"/>
       <w:pgMar w:top="1080" w:right="900" w:bottom="1440" w:left="900" w:header="720" w:footer="720" w:gutter="0"/>
       <w:docGrid w:linePitch="360"/>
       <w:cols w:num="2" w:space="360"/>

</xml_diff>

<commit_message>
Explain the design choice where the judge ranking is reported
The judge panel cannot separate the four Phi-scale systems, so third place
does not decide between the two-stage design and the same generator used
alone. Thesis 5.1.8 and paper Section V-A now say what the ranking settles,
what it does not, and which measures the selection rests on (Table 5.29,
Section 5.4.9 / V-C, composite Table 5.30). Paper Section V-C retitled to
name the question it answers.

Co-Authored-By: Claude Opus 5 (1M context) <noreply@anthropic.com>
</commit_message>
<xml_diff>
--- a/ICCIT format writing/paper.docx
+++ b/ICCIT format writing/paper.docx
@@ -2937,7 +2937,7 @@
           <w:rFonts w:ascii="Times New Roman" w:hAnsi="Times New Roman"/>
           <w:sz w:val="20"/>
         </w:rPr>
-        <w:t>Table I summarises all systems. Our system achieves the highest emotion validation (36.7%) of any system and the second-highest WASSA score, behind only the 7.6B single model; on the AI judges it lies third, within 0.22 points of the highest-scoring system. The fine-tuned model learns the style of ED listeners: 10-word replies that usually ask a question but rarely acknowledge the feeling (30.0%), meeting all rules in 22.3% of cases. Retrieval augmentation lowered the initial pipeline's rule adherence from 63.7% to 43.7%, as the retrieved listener replies model the same style. Because the measures disagree, we also summarise them by standardising five of them (rule adherence, WASSA, emotion validation, judge empathy and freedom from boilerplate) across systems and averaging them with equal weight: our system ranks second of eight, behind only the 7.6B single model, which needs 1.9 times the parameters and 62% more GPU memory, and first among the systems that fit the 8 GB budget. Removing any one measure leaves it second or third, so the ranking does not depend on a single favourable measure.</w:t>
+        <w:t>Table I summarises all systems. Our system achieves the highest emotion validation (36.7%) of any system and the second-highest WASSA score, behind only the 7.6B single model; on the AI judges it lies third, within 0.22 points of the highest-scoring system. The four leading systems all use a generator of 3.8B parameters or more, lie within that 0.22-point band and are not significantly different from one another (Section V-B), and the judges reward length, so the judge ranking does not by itself decide between our design and prompting the same generator directly; Section V-C makes that comparison on the measures that do separate them. The fine-tuned model learns the style of ED listeners: 10-word replies that usually ask a question but rarely acknowledge the feeling (30.0%), meeting all rules in 22.3% of cases. Retrieval augmentation lowered the initial pipeline's rule adherence from 63.7% to 43.7%, as the retrieved listener replies model the same style. Because the measures disagree, we also summarise them by standardising five of them (rule adherence, WASSA, emotion validation, judge empathy and freedom from boilerplate) across systems and averaging them with equal weight: our system ranks second of eight, behind only the 7.6B single model, which needs 1.9 times the parameters and 62% more GPU memory, and first among the systems that fit the 8 GB budget. Removing any one measure leaves it second or third, so the ranking does not depend on a single favourable measure.</w:t>
       </w:r>
     </w:p>
     <w:p>
@@ -3572,7 +3572,7 @@
           <w:i/>
           <w:sz w:val="20"/>
         </w:rPr>
-        <w:t>C. Decoupling Versus Guidance</w:t>
+        <w:t>C. Why the Two-Stage Design Rather Than the Same Generator Alone</w:t>
       </w:r>
     </w:p>
     <w:p>
@@ -3616,7 +3616,7 @@
           <w:rFonts w:ascii="Times New Roman" w:hAnsi="Times New Roman"/>
           <w:sz w:val="20"/>
         </w:rPr>
-        <w:t xml:space="preserve"> Moving from Qwen2.5-1.5B to Phi-4-mini as a single model raises rule adherence from 51.3% to 73.7% (p &lt; 0.001) but leaves WASSA (4.84 to 4.75, p = 0.18) and emotion validation (25.7% to 27.0%, p = 0.70) unchanged: a larger generator alone buys none of the empathy we report. Adding the detector and emotion-specific guidance to that same generator raises WASSA to 5.05 (+0.30, adjusted p &lt; 0.001) and emotion validation to 36.7% (+9.7 points, adjusted p = 0.007). The design's cost is rule adherence, which falls to 60.0% (-13.7 points, p = 0.002), mainly through the keyword-based acknowledgement check (66.3% against 77.3%), because the rules share the prompt with emotion-specific guidance. The AI judges place the two level (empathy 7.84 against 8.04, p = 0.077; overall 8.68 against 8.78, p = 0.16). The two differ in length (57.1 against 73.5 words), and with length held constant the acknowledgement difference disappears (p = 0.36) while the WASSA advantage strengthens (p &lt; 0.001); at matched length the judge scores coincide (7.92 against 7.89 for 40-60 word replies). The decoupled system also repeats itself less (boilerplate 58.7% against 72.3%, distinct-2 47.8% against 39.1%) and writes 22% fewer words. At an equal generator the decoupled design therefore trades part of its rule adherence for significantly more empathetic and more emotionally faithful replies. The two-stage prompt also depends on generator capacity: with Qwen2.5-1.5B it reduced rule adherence to 36.7%.</w:t>
+        <w:t xml:space="preserve"> Moving from Qwen2.5-1.5B to Phi-4-mini as a single model raises rule adherence from 51.3% to 73.7% (p &lt; 0.001) but leaves WASSA (4.84 to 4.75, p = 0.18) and emotion validation (25.7% to 27.0%, p = 0.70) unchanged: a larger generator alone buys none of the empathy we report. Adding the detector and emotion-specific guidance to that same generator raises WASSA to 5.05 (+0.30, adjusted p &lt; 0.001) and emotion validation to 36.7% (+9.7 points, adjusted p = 0.007). The design's cost is rule adherence, which falls to 60.0% (-13.7 points, p = 0.002), mainly through the keyword-based acknowledgement check (66.3% against 77.3%), because the rules share the prompt with emotion-specific guidance. The AI judges place the two level (empathy 7.84 against 8.04, p = 0.077; overall 8.68 against 8.78, p = 0.16). The two differ in length (57.1 against 73.5 words), and with length held constant the acknowledgement difference disappears (p = 0.36) while the WASSA advantage strengthens (p &lt; 0.001); at matched length the judge scores coincide (7.92 against 7.89 for 40-60 word replies). The decoupled system also repeats itself less (boilerplate 58.7% against 72.3%, distinct-2 47.8% against 39.1%) and writes 22% fewer words. At an equal generator the decoupled design therefore trades part of its rule adherence for significantly more empathetic and more emotionally faithful replies. We kept it for those gains, for the shorter and less repetitive replies, and because the emotion it responds to is visible and can be logged or overridden before generation, and we report the rule-adherence cost rather than claim an advantage on every measure. The two-stage prompt also depends on generator capacity: with Qwen2.5-1.5B it reduced rule adherence to 36.7%.</w:t>
       </w:r>
     </w:p>
     <w:p>

</xml_diff>